<commit_message>
Rewrite the submission document in plain black styling and add screenshot evidence
Rework the prose in my own voice, drop the em-dash habit from headings and
captions, and set the whole document in black instead of the purple accent.

Add section 5.9 with every page captured at 390px and 1280px, and add the
three W3C CSS Validation Service result pages to section 5.4. Rebuild the
PDF and the Word version from the updated source.
</commit_message>
<xml_diff>
--- a/docs/Toy-Haven-Submission-Document.docx
+++ b/docs/Toy-Haven-Submission-Document.docx
@@ -13,9 +13,9 @@
     <w:p>
       <w:r>
         <w:rPr>
-          <w:color w:val="56545F"/>
+          <w:color w:val="000000"/>
         </w:rPr>
-        <w:t>Assignment 3 — COMP40053 — front-end website submission document</w:t>
+        <w:t>Assignment 3, COMP40053: front-end website submission document</w:t>
       </w:r>
     </w:p>
     <w:tbl>
@@ -37,7 +37,7 @@
         <w:tc>
           <w:tcPr>
             <w:tcW w:type="dxa" w:w="2304"/>
-            <w:shd w:val="clear" w:fill="FAF8FF"/>
+            <w:shd w:val="clear" w:fill="F5F5F5"/>
           </w:tcPr>
           <w:p>
             <w:pPr>
@@ -63,7 +63,7 @@
             <w:hyperlink r:id="rId9">
               <w:r>
                 <w:rPr>
-                  <w:color w:val="5B2BD9"/>
+                  <w:color w:val="000000"/>
                   <w:u w:val="single"/>
                 </w:rPr>
                 <w:t xml:space="preserve">https://nihmathullahmazhar.github.io/toy-haven/</w:t>
@@ -79,7 +79,7 @@
         <w:tc>
           <w:tcPr>
             <w:tcW w:type="dxa" w:w="2304"/>
-            <w:shd w:val="clear" w:fill="FAF8FF"/>
+            <w:shd w:val="clear" w:fill="F5F5F5"/>
           </w:tcPr>
           <w:p>
             <w:pPr>
@@ -105,7 +105,7 @@
             <w:hyperlink r:id="rId10">
               <w:r>
                 <w:rPr>
-                  <w:color w:val="5B2BD9"/>
+                  <w:color w:val="000000"/>
                   <w:u w:val="single"/>
                 </w:rPr>
                 <w:t xml:space="preserve">https://github.com/nihmathullahmazhar/toy-haven</w:t>
@@ -121,7 +121,7 @@
         <w:tc>
           <w:tcPr>
             <w:tcW w:type="dxa" w:w="2304"/>
-            <w:shd w:val="clear" w:fill="FAF8FF"/>
+            <w:shd w:val="clear" w:fill="F5F5F5"/>
           </w:tcPr>
           <w:p>
             <w:pPr>
@@ -160,7 +160,7 @@
         <w:tc>
           <w:tcPr>
             <w:tcW w:type="dxa" w:w="2304"/>
-            <w:shd w:val="clear" w:fill="FAF8FF"/>
+            <w:shd w:val="clear" w:fill="F5F5F5"/>
           </w:tcPr>
           <w:p>
             <w:pPr>
@@ -206,7 +206,7 @@
         <w:tc>
           <w:tcPr>
             <w:tcW w:type="dxa" w:w="2304"/>
-            <w:shd w:val="clear" w:fill="FAF8FF"/>
+            <w:shd w:val="clear" w:fill="F5F5F5"/>
           </w:tcPr>
           <w:p>
             <w:pPr>
@@ -244,7 +244,7 @@
       <w:pPr>
         <w:pStyle w:val="Heading2"/>
         <w:pBdr>
-          <w:bottom w:val="single" w:sz="12" w:space="2" w:color="5B2BD9"/>
+          <w:bottom w:val="single" w:sz="12" w:space="2" w:color="000000"/>
         </w:pBdr>
       </w:pPr>
       <w:r>
@@ -253,7 +253,7 @@
     </w:p>
     <w:p>
       <w:r>
-        <w:t xml:space="preserve">Toy Haven is a multi-page front-end store for collectible figurines, toys, board games and diecast model cars. It was built mobile-first with no frameworks: three organised stylesheets, one shared JavaScript core and one small script per page. The 24-product catalogue is a JSON array in </w:t>
+        <w:t xml:space="preserve">Toy Haven is a six-page front-end store selling collectible figurines, toys, board games and diecast model cars. I built it mobile first and without a framework, so the whole site is three stylesheets, one shared JavaScript file and a small script for each page. All 24 products sit in a single JSON array in </w:t>
       </w:r>
       <w:r>
         <w:rPr>
@@ -263,12 +263,12 @@
         <w:t>js/data.js</w:t>
       </w:r>
       <w:r>
-        <w:t xml:space="preserve">, so every listing, card, modal, basket row and order line is rendered from a single source of data. </w:t>
+        <w:t xml:space="preserve">, and every listing, card, modal, basket row and order line is drawn from that one array. </w:t>
       </w:r>
     </w:p>
     <w:p>
       <w:r>
-        <w:t xml:space="preserve">Because there is no back end, every interaction that a real store would send to a server is instead written to </w:t>
+        <w:t xml:space="preserve">There is no server behind the site, so anything a real shop would send to one is saved in </w:t>
       </w:r>
       <w:r>
         <w:rPr>
@@ -278,14 +278,14 @@
         <w:t>localStorage</w:t>
       </w:r>
       <w:r>
-        <w:t xml:space="preserve">: the basket survives a page refresh and a browser restart, the wishlist keeps a status per product, checkout writes an order into a local history, and the feedback form stores each message so the visitor can see exactly what was captured. The site is also a progressive web app — it can be installed to a home screen and previously visited pages keep working with no connection. </w:t>
+        <w:t xml:space="preserve"> instead. The basket survives a refresh and a browser restart, the wishlist remembers a status for each product, checkout writes the order into a local order history, and the feedback form keeps every message so the visitor can see what was actually recorded. The site is also a progressive web app, which means it can be installed to a home screen and pages that have already been visited still open with no connection. </w:t>
       </w:r>
     </w:p>
     <w:p>
       <w:pPr>
         <w:pStyle w:val="Heading2"/>
         <w:pBdr>
-          <w:bottom w:val="single" w:sz="12" w:space="2" w:color="5B2BD9"/>
+          <w:bottom w:val="single" w:sz="12" w:space="2" w:color="000000"/>
         </w:pBdr>
       </w:pPr>
       <w:r>
@@ -302,7 +302,7 @@
     </w:p>
     <w:p>
       <w:r>
-        <w:t xml:space="preserve">Every page was wireframed at 375px first and then widened, which is why the CSS contains only </w:t>
+        <w:t xml:space="preserve">I drew every page at 375px first and widened it from there, which is why the CSS only uses </w:t>
       </w:r>
       <w:r>
         <w:rPr>
@@ -312,7 +312,7 @@
         <w:t>min-width</w:t>
       </w:r>
       <w:r>
-        <w:t xml:space="preserve"> media queries: the mobile layout is the default and larger screens add columns rather than remove them. The breakpoints used throughout are </w:t>
+        <w:t xml:space="preserve"> media queries. The mobile layout is the default and wider screens add columns rather than take them away. There are four breakpoints: </w:t>
       </w:r>
       <w:r>
         <w:rPr>
@@ -330,7 +330,7 @@
         <w:t>48em (768px)</w:t>
       </w:r>
       <w:r>
-        <w:t xml:space="preserve"> for the modal and footer, </w:t>
+        <w:t xml:space="preserve"> for the modal and the footer, </w:t>
       </w:r>
       <w:r>
         <w:rPr>
@@ -339,7 +339,7 @@
         <w:t>55em (880px)</w:t>
       </w:r>
       <w:r>
-        <w:t xml:space="preserve"> where the navigation collapses into the animated hamburger, and </w:t>
+        <w:t xml:space="preserve"> where the navigation turns into the animated hamburger, and </w:t>
       </w:r>
       <w:r>
         <w:rPr>
@@ -368,7 +368,7 @@
         <w:rPr>
           <w:b/>
         </w:rPr>
-        <w:t xml:space="preserve">Design tokens — declared once in </w:t>
+        <w:t xml:space="preserve">Design tokens, declared once in </w:t>
       </w:r>
       <w:r>
         <w:rPr>
@@ -405,7 +405,7 @@
         <w:tc>
           <w:tcPr>
             <w:tcW w:type="dxa" w:w="3216"/>
-            <w:shd w:val="clear" w:fill="F4F1FA"/>
+            <w:shd w:val="clear" w:fill="EFEFEF"/>
           </w:tcPr>
           <w:p>
             <w:pPr>
@@ -424,7 +424,7 @@
         <w:tc>
           <w:tcPr>
             <w:tcW w:type="dxa" w:w="3216"/>
-            <w:shd w:val="clear" w:fill="F4F1FA"/>
+            <w:shd w:val="clear" w:fill="EFEFEF"/>
           </w:tcPr>
           <w:p>
             <w:pPr>
@@ -443,7 +443,7 @@
         <w:tc>
           <w:tcPr>
             <w:tcW w:type="dxa" w:w="3216"/>
-            <w:shd w:val="clear" w:fill="F4F1FA"/>
+            <w:shd w:val="clear" w:fill="EFEFEF"/>
           </w:tcPr>
           <w:p>
             <w:pPr>
@@ -940,7 +940,7 @@
     <w:p/>
     <w:p>
       <w:r>
-        <w:t xml:space="preserve">The same tokens are redefined once under </w:t>
+        <w:t xml:space="preserve">The same tokens are declared a second time under </w:t>
       </w:r>
       <w:r>
         <w:rPr>
@@ -950,7 +950,7 @@
         <w:t>[data-theme="dark"]</w:t>
       </w:r>
       <w:r>
-        <w:t xml:space="preserve">, which is how the theme switch in the header recolours the entire site without duplicating a single rule. Both themes were checked for contrast and both pass at AA. </w:t>
+        <w:t xml:space="preserve">, and that is all the theme switch in the header needs in order to recolour the site. No rule is written twice. I checked both themes for contrast and both pass at AA. </w:t>
       </w:r>
     </w:p>
     <w:p>
@@ -963,12 +963,12 @@
     </w:p>
     <w:p>
       <w:r>
-        <w:t xml:space="preserve">Each wireframe shows the mobile layout that was designed first next to the desktop layout it grows into. They follow the low-fidelity conventions taught in the module: black and white lines only, no graphics, no dummy text and no colour, so the discussion stays on structure, hierarchy and functionality rather than on visual design. </w:t>
+        <w:t xml:space="preserve">Each wireframe puts the mobile layout I designed first next to the desktop layout it grows into. They keep to the low-fidelity conventions taught in the module: black and white lines, no graphics, no dummy text and no colour, so the discussion stays on structure, hierarchy and function rather than on visual design. </w:t>
       </w:r>
     </w:p>
     <w:p>
       <w:r>
-        <w:t>The notation used throughout is:</w:t>
+        <w:t>The notation I used is:</w:t>
       </w:r>
     </w:p>
     <w:p>
@@ -1138,7 +1138,7 @@
       <w:r>
         <w:rPr>
           <w:i/>
-          <w:color w:val="56545F"/>
+          <w:color w:val="000000"/>
           <w:sz w:val="18"/>
         </w:rPr>
         <w:t>Wireframe of the home page in mobile and desktop layouts</w:t>
@@ -1191,7 +1191,7 @@
       <w:r>
         <w:rPr>
           <w:i/>
-          <w:color w:val="56545F"/>
+          <w:color w:val="000000"/>
           <w:sz w:val="18"/>
         </w:rPr>
         <w:t>Wireframe of the product listing page in mobile and desktop layouts</w:t>
@@ -1244,7 +1244,7 @@
       <w:r>
         <w:rPr>
           <w:i/>
-          <w:color w:val="56545F"/>
+          <w:color w:val="000000"/>
           <w:sz w:val="18"/>
         </w:rPr>
         <w:t>Wireframe of the shopping cart page in mobile and desktop layouts</w:t>
@@ -1297,7 +1297,7 @@
       <w:r>
         <w:rPr>
           <w:i/>
-          <w:color w:val="56545F"/>
+          <w:color w:val="000000"/>
           <w:sz w:val="18"/>
         </w:rPr>
         <w:t>Wireframe of the checkout page in mobile and desktop layouts</w:t>
@@ -1350,7 +1350,7 @@
       <w:r>
         <w:rPr>
           <w:i/>
-          <w:color w:val="56545F"/>
+          <w:color w:val="000000"/>
           <w:sz w:val="18"/>
         </w:rPr>
         <w:t>Wireframe of the wishlist page in mobile and desktop layouts</w:t>
@@ -1403,7 +1403,7 @@
       <w:r>
         <w:rPr>
           <w:i/>
-          <w:color w:val="56545F"/>
+          <w:color w:val="000000"/>
           <w:sz w:val="18"/>
         </w:rPr>
         <w:t>Wireframe of the feedback and support page in mobile and desktop layouts</w:t>
@@ -1413,7 +1413,7 @@
       <w:pPr>
         <w:pStyle w:val="Heading2"/>
         <w:pBdr>
-          <w:bottom w:val="single" w:sz="12" w:space="2" w:color="5B2BD9"/>
+          <w:bottom w:val="single" w:sz="12" w:space="2" w:color="000000"/>
         </w:pBdr>
       </w:pPr>
       <w:r>
@@ -1451,7 +1451,7 @@
         <w:tc>
           <w:tcPr>
             <w:tcW w:type="dxa" w:w="4824"/>
-            <w:shd w:val="clear" w:fill="F4F1FA"/>
+            <w:shd w:val="clear" w:fill="EFEFEF"/>
           </w:tcPr>
           <w:p>
             <w:pPr>
@@ -1470,7 +1470,7 @@
         <w:tc>
           <w:tcPr>
             <w:tcW w:type="dxa" w:w="4824"/>
-            <w:shd w:val="clear" w:fill="F4F1FA"/>
+            <w:shd w:val="clear" w:fill="EFEFEF"/>
           </w:tcPr>
           <w:p>
             <w:pPr>
@@ -1903,7 +1903,7 @@
       <w:pPr>
         <w:pStyle w:val="Heading2"/>
         <w:pBdr>
-          <w:bottom w:val="single" w:sz="12" w:space="2" w:color="5B2BD9"/>
+          <w:bottom w:val="single" w:sz="12" w:space="2" w:color="000000"/>
         </w:pBdr>
       </w:pPr>
       <w:r>
@@ -1920,7 +1920,7 @@
         <w:t>js/app.js</w:t>
       </w:r>
       <w:r>
-        <w:t xml:space="preserve"> returns one object, </w:t>
+        <w:t xml:space="preserve"> returns a single object called </w:t>
       </w:r>
       <w:r>
         <w:rPr>
@@ -1930,7 +1930,7 @@
         <w:t>TH</w:t>
       </w:r>
       <w:r>
-        <w:t xml:space="preserve">, that every page uses; </w:t>
+        <w:t xml:space="preserve"> that every page uses, and </w:t>
       </w:r>
       <w:r>
         <w:rPr>
@@ -1950,7 +1950,7 @@
         <w:t>THUI</w:t>
       </w:r>
       <w:r>
-        <w:t xml:space="preserve">, which owns the shared markup. Nothing that appears on more than one page is written twice. </w:t>
+        <w:t xml:space="preserve">, which owns the markup shared between pages. If something appears on more than one page it is written once and reused. </w:t>
       </w:r>
     </w:p>
     <w:p>
@@ -1985,7 +1985,7 @@
         <w:tc>
           <w:tcPr>
             <w:tcW w:type="dxa" w:w="3216"/>
-            <w:shd w:val="clear" w:fill="F4F1FA"/>
+            <w:shd w:val="clear" w:fill="EFEFEF"/>
           </w:tcPr>
           <w:p>
             <w:pPr>
@@ -2004,7 +2004,7 @@
         <w:tc>
           <w:tcPr>
             <w:tcW w:type="dxa" w:w="3216"/>
-            <w:shd w:val="clear" w:fill="F4F1FA"/>
+            <w:shd w:val="clear" w:fill="EFEFEF"/>
           </w:tcPr>
           <w:p>
             <w:pPr>
@@ -2023,7 +2023,7 @@
         <w:tc>
           <w:tcPr>
             <w:tcW w:type="dxa" w:w="3216"/>
-            <w:shd w:val="clear" w:fill="F4F1FA"/>
+            <w:shd w:val="clear" w:fill="EFEFEF"/>
           </w:tcPr>
           <w:p>
             <w:pPr>
@@ -2711,7 +2711,7 @@
       <w:pPr>
         <w:pStyle w:val="Heading2"/>
         <w:pBdr>
-          <w:bottom w:val="single" w:sz="12" w:space="2" w:color="5B2BD9"/>
+          <w:bottom w:val="single" w:sz="12" w:space="2" w:color="000000"/>
         </w:pBdr>
       </w:pPr>
       <w:r>
@@ -2737,7 +2737,7 @@
         <w:t>Functional testing</w:t>
       </w:r>
       <w:r>
-        <w:t xml:space="preserve"> — the 48 test cases below were executed in Google Chrome 152 on macOS, against the deployed site and a local server.</w:t>
+        <w:t>: the 48 test cases below were executed in Google Chrome 152 on macOS, against the deployed site and a local server.</w:t>
       </w:r>
     </w:p>
     <w:p>
@@ -2751,7 +2751,7 @@
         <w:t>HTML validity</w:t>
       </w:r>
       <w:r>
-        <w:t xml:space="preserve"> — every page submitted to the W3C Nu Markup Validation Service.</w:t>
+        <w:t>: every page submitted to the W3C Nu Markup Validation Service.</w:t>
       </w:r>
     </w:p>
     <w:p>
@@ -2765,7 +2765,7 @@
         <w:t>CSS validity</w:t>
       </w:r>
       <w:r>
-        <w:t xml:space="preserve"> — all three stylesheets submitted to the W3C CSS Validation Service (CSS level 3 + SVG profile).</w:t>
+        <w:t>: all three stylesheets submitted to the W3C CSS Validation Service (CSS level 3 + SVG profile).</w:t>
       </w:r>
     </w:p>
     <w:p>
@@ -2779,7 +2779,7 @@
         <w:t>Accessibility</w:t>
       </w:r>
       <w:r>
-        <w:t xml:space="preserve"> — WAVE and axe-core run on every page, in both light and dark themes, including the open modal and the invalid-form state.</w:t>
+        <w:t>: WAVE and axe-core run on every page, in both light and dark themes, including the open modal and the invalid-form state.</w:t>
       </w:r>
     </w:p>
     <w:p>
@@ -2793,7 +2793,7 @@
         <w:t>Lighthouse</w:t>
       </w:r>
       <w:r>
-        <w:t xml:space="preserve"> — every page audited in both the mobile and desktop presets.</w:t>
+        <w:t>: every page audited in both the mobile and desktop presets.</w:t>
       </w:r>
     </w:p>
     <w:p>
@@ -2807,7 +2807,7 @@
         <w:t>Responsiveness</w:t>
       </w:r>
       <w:r>
-        <w:t xml:space="preserve"> — checked at 320, 375, 414, 768, 1024, 1280 and 1600px.</w:t>
+        <w:t>: checked at 320, 375, 414, 768, 1024, 1280 and 1600px.</w:t>
       </w:r>
     </w:p>
     <w:p>
@@ -2827,7 +2827,7 @@
         <w:rPr>
           <w:b/>
         </w:rPr>
-        <w:t>48 functional test cases — all executed and passed</w:t>
+        <w:t>48 functional test cases, all executed and passed</w:t>
       </w:r>
     </w:p>
     <w:tbl>
@@ -2853,7 +2853,7 @@
         <w:tc>
           <w:tcPr>
             <w:tcW w:type="dxa" w:w="1608"/>
-            <w:shd w:val="clear" w:fill="F4F1FA"/>
+            <w:shd w:val="clear" w:fill="EFEFEF"/>
           </w:tcPr>
           <w:p>
             <w:pPr>
@@ -2872,7 +2872,7 @@
         <w:tc>
           <w:tcPr>
             <w:tcW w:type="dxa" w:w="1608"/>
-            <w:shd w:val="clear" w:fill="F4F1FA"/>
+            <w:shd w:val="clear" w:fill="EFEFEF"/>
           </w:tcPr>
           <w:p>
             <w:pPr>
@@ -2891,7 +2891,7 @@
         <w:tc>
           <w:tcPr>
             <w:tcW w:type="dxa" w:w="1608"/>
-            <w:shd w:val="clear" w:fill="F4F1FA"/>
+            <w:shd w:val="clear" w:fill="EFEFEF"/>
           </w:tcPr>
           <w:p>
             <w:pPr>
@@ -2910,7 +2910,7 @@
         <w:tc>
           <w:tcPr>
             <w:tcW w:type="dxa" w:w="1608"/>
-            <w:shd w:val="clear" w:fill="F4F1FA"/>
+            <w:shd w:val="clear" w:fill="EFEFEF"/>
           </w:tcPr>
           <w:p>
             <w:pPr>
@@ -2929,7 +2929,7 @@
         <w:tc>
           <w:tcPr>
             <w:tcW w:type="dxa" w:w="1608"/>
-            <w:shd w:val="clear" w:fill="F4F1FA"/>
+            <w:shd w:val="clear" w:fill="EFEFEF"/>
           </w:tcPr>
           <w:p>
             <w:pPr>
@@ -2948,7 +2948,7 @@
         <w:tc>
           <w:tcPr>
             <w:tcW w:type="dxa" w:w="1608"/>
-            <w:shd w:val="clear" w:fill="F4F1FA"/>
+            <w:shd w:val="clear" w:fill="EFEFEF"/>
           </w:tcPr>
           <w:p>
             <w:pPr>
@@ -3066,7 +3066,7 @@
               <w:rPr>
                 <w:rFonts w:ascii="Calibri" w:hAnsi="Calibri"/>
                 <w:b/>
-                <w:color w:val="0B7A4B"/>
+                <w:color w:val="000000"/>
                 <w:sz w:val="19"/>
               </w:rPr>
               <w:t>Pass</w:t>
@@ -3175,7 +3175,7 @@
               <w:rPr>
                 <w:rFonts w:ascii="Calibri" w:hAnsi="Calibri"/>
                 <w:b/>
-                <w:color w:val="0B7A4B"/>
+                <w:color w:val="000000"/>
                 <w:sz w:val="19"/>
               </w:rPr>
               <w:t>Pass</w:t>
@@ -3284,7 +3284,7 @@
               <w:rPr>
                 <w:rFonts w:ascii="Calibri" w:hAnsi="Calibri"/>
                 <w:b/>
-                <w:color w:val="0B7A4B"/>
+                <w:color w:val="000000"/>
                 <w:sz w:val="19"/>
               </w:rPr>
               <w:t>Pass</w:t>
@@ -3393,7 +3393,7 @@
               <w:rPr>
                 <w:rFonts w:ascii="Calibri" w:hAnsi="Calibri"/>
                 <w:b/>
-                <w:color w:val="0B7A4B"/>
+                <w:color w:val="000000"/>
                 <w:sz w:val="19"/>
               </w:rPr>
               <w:t>Pass</w:t>
@@ -3502,7 +3502,7 @@
               <w:rPr>
                 <w:rFonts w:ascii="Calibri" w:hAnsi="Calibri"/>
                 <w:b/>
-                <w:color w:val="0B7A4B"/>
+                <w:color w:val="000000"/>
                 <w:sz w:val="19"/>
               </w:rPr>
               <w:t>Pass</w:t>
@@ -3611,7 +3611,7 @@
               <w:rPr>
                 <w:rFonts w:ascii="Calibri" w:hAnsi="Calibri"/>
                 <w:b/>
-                <w:color w:val="0B7A4B"/>
+                <w:color w:val="000000"/>
                 <w:sz w:val="19"/>
               </w:rPr>
               <w:t>Pass</w:t>
@@ -3720,7 +3720,7 @@
               <w:rPr>
                 <w:rFonts w:ascii="Calibri" w:hAnsi="Calibri"/>
                 <w:b/>
-                <w:color w:val="0B7A4B"/>
+                <w:color w:val="000000"/>
                 <w:sz w:val="19"/>
               </w:rPr>
               <w:t>Pass</w:t>
@@ -3829,7 +3829,7 @@
               <w:rPr>
                 <w:rFonts w:ascii="Calibri" w:hAnsi="Calibri"/>
                 <w:b/>
-                <w:color w:val="0B7A4B"/>
+                <w:color w:val="000000"/>
                 <w:sz w:val="19"/>
               </w:rPr>
               <w:t>Pass</w:t>
@@ -3938,7 +3938,7 @@
               <w:rPr>
                 <w:rFonts w:ascii="Calibri" w:hAnsi="Calibri"/>
                 <w:b/>
-                <w:color w:val="0B7A4B"/>
+                <w:color w:val="000000"/>
                 <w:sz w:val="19"/>
               </w:rPr>
               <w:t>Pass</w:t>
@@ -4047,7 +4047,7 @@
               <w:rPr>
                 <w:rFonts w:ascii="Calibri" w:hAnsi="Calibri"/>
                 <w:b/>
-                <w:color w:val="0B7A4B"/>
+                <w:color w:val="000000"/>
                 <w:sz w:val="19"/>
               </w:rPr>
               <w:t>Pass</w:t>
@@ -4156,7 +4156,7 @@
               <w:rPr>
                 <w:rFonts w:ascii="Calibri" w:hAnsi="Calibri"/>
                 <w:b/>
-                <w:color w:val="0B7A4B"/>
+                <w:color w:val="000000"/>
                 <w:sz w:val="19"/>
               </w:rPr>
               <w:t>Pass</w:t>
@@ -4265,7 +4265,7 @@
               <w:rPr>
                 <w:rFonts w:ascii="Calibri" w:hAnsi="Calibri"/>
                 <w:b/>
-                <w:color w:val="0B7A4B"/>
+                <w:color w:val="000000"/>
                 <w:sz w:val="19"/>
               </w:rPr>
               <w:t>Pass</w:t>
@@ -4374,7 +4374,7 @@
               <w:rPr>
                 <w:rFonts w:ascii="Calibri" w:hAnsi="Calibri"/>
                 <w:b/>
-                <w:color w:val="0B7A4B"/>
+                <w:color w:val="000000"/>
                 <w:sz w:val="19"/>
               </w:rPr>
               <w:t>Pass</w:t>
@@ -4483,7 +4483,7 @@
               <w:rPr>
                 <w:rFonts w:ascii="Calibri" w:hAnsi="Calibri"/>
                 <w:b/>
-                <w:color w:val="0B7A4B"/>
+                <w:color w:val="000000"/>
                 <w:sz w:val="19"/>
               </w:rPr>
               <w:t>Pass</w:t>
@@ -4592,7 +4592,7 @@
               <w:rPr>
                 <w:rFonts w:ascii="Calibri" w:hAnsi="Calibri"/>
                 <w:b/>
-                <w:color w:val="0B7A4B"/>
+                <w:color w:val="000000"/>
                 <w:sz w:val="19"/>
               </w:rPr>
               <w:t>Pass</w:t>
@@ -4701,7 +4701,7 @@
               <w:rPr>
                 <w:rFonts w:ascii="Calibri" w:hAnsi="Calibri"/>
                 <w:b/>
-                <w:color w:val="0B7A4B"/>
+                <w:color w:val="000000"/>
                 <w:sz w:val="19"/>
               </w:rPr>
               <w:t>Pass</w:t>
@@ -4810,7 +4810,7 @@
               <w:rPr>
                 <w:rFonts w:ascii="Calibri" w:hAnsi="Calibri"/>
                 <w:b/>
-                <w:color w:val="0B7A4B"/>
+                <w:color w:val="000000"/>
                 <w:sz w:val="19"/>
               </w:rPr>
               <w:t>Pass</w:t>
@@ -4919,7 +4919,7 @@
               <w:rPr>
                 <w:rFonts w:ascii="Calibri" w:hAnsi="Calibri"/>
                 <w:b/>
-                <w:color w:val="0B7A4B"/>
+                <w:color w:val="000000"/>
                 <w:sz w:val="19"/>
               </w:rPr>
               <w:t>Pass</w:t>
@@ -5028,7 +5028,7 @@
               <w:rPr>
                 <w:rFonts w:ascii="Calibri" w:hAnsi="Calibri"/>
                 <w:b/>
-                <w:color w:val="0B7A4B"/>
+                <w:color w:val="000000"/>
                 <w:sz w:val="19"/>
               </w:rPr>
               <w:t>Pass</w:t>
@@ -5137,7 +5137,7 @@
               <w:rPr>
                 <w:rFonts w:ascii="Calibri" w:hAnsi="Calibri"/>
                 <w:b/>
-                <w:color w:val="0B7A4B"/>
+                <w:color w:val="000000"/>
                 <w:sz w:val="19"/>
               </w:rPr>
               <w:t>Pass</w:t>
@@ -5246,7 +5246,7 @@
               <w:rPr>
                 <w:rFonts w:ascii="Calibri" w:hAnsi="Calibri"/>
                 <w:b/>
-                <w:color w:val="0B7A4B"/>
+                <w:color w:val="000000"/>
                 <w:sz w:val="19"/>
               </w:rPr>
               <w:t>Pass</w:t>
@@ -5355,7 +5355,7 @@
               <w:rPr>
                 <w:rFonts w:ascii="Calibri" w:hAnsi="Calibri"/>
                 <w:b/>
-                <w:color w:val="0B7A4B"/>
+                <w:color w:val="000000"/>
                 <w:sz w:val="19"/>
               </w:rPr>
               <w:t>Pass</w:t>
@@ -5464,7 +5464,7 @@
               <w:rPr>
                 <w:rFonts w:ascii="Calibri" w:hAnsi="Calibri"/>
                 <w:b/>
-                <w:color w:val="0B7A4B"/>
+                <w:color w:val="000000"/>
                 <w:sz w:val="19"/>
               </w:rPr>
               <w:t>Pass</w:t>
@@ -5573,7 +5573,7 @@
               <w:rPr>
                 <w:rFonts w:ascii="Calibri" w:hAnsi="Calibri"/>
                 <w:b/>
-                <w:color w:val="0B7A4B"/>
+                <w:color w:val="000000"/>
                 <w:sz w:val="19"/>
               </w:rPr>
               <w:t>Pass</w:t>
@@ -5682,7 +5682,7 @@
               <w:rPr>
                 <w:rFonts w:ascii="Calibri" w:hAnsi="Calibri"/>
                 <w:b/>
-                <w:color w:val="0B7A4B"/>
+                <w:color w:val="000000"/>
                 <w:sz w:val="19"/>
               </w:rPr>
               <w:t>Pass</w:t>
@@ -5791,7 +5791,7 @@
               <w:rPr>
                 <w:rFonts w:ascii="Calibri" w:hAnsi="Calibri"/>
                 <w:b/>
-                <w:color w:val="0B7A4B"/>
+                <w:color w:val="000000"/>
                 <w:sz w:val="19"/>
               </w:rPr>
               <w:t>Pass</w:t>
@@ -5900,7 +5900,7 @@
               <w:rPr>
                 <w:rFonts w:ascii="Calibri" w:hAnsi="Calibri"/>
                 <w:b/>
-                <w:color w:val="0B7A4B"/>
+                <w:color w:val="000000"/>
                 <w:sz w:val="19"/>
               </w:rPr>
               <w:t>Pass</w:t>
@@ -6009,7 +6009,7 @@
               <w:rPr>
                 <w:rFonts w:ascii="Calibri" w:hAnsi="Calibri"/>
                 <w:b/>
-                <w:color w:val="0B7A4B"/>
+                <w:color w:val="000000"/>
                 <w:sz w:val="19"/>
               </w:rPr>
               <w:t>Pass</w:t>
@@ -6118,7 +6118,7 @@
               <w:rPr>
                 <w:rFonts w:ascii="Calibri" w:hAnsi="Calibri"/>
                 <w:b/>
-                <w:color w:val="0B7A4B"/>
+                <w:color w:val="000000"/>
                 <w:sz w:val="19"/>
               </w:rPr>
               <w:t>Pass</w:t>
@@ -6227,7 +6227,7 @@
               <w:rPr>
                 <w:rFonts w:ascii="Calibri" w:hAnsi="Calibri"/>
                 <w:b/>
-                <w:color w:val="0B7A4B"/>
+                <w:color w:val="000000"/>
                 <w:sz w:val="19"/>
               </w:rPr>
               <w:t>Pass</w:t>
@@ -6336,7 +6336,7 @@
               <w:rPr>
                 <w:rFonts w:ascii="Calibri" w:hAnsi="Calibri"/>
                 <w:b/>
-                <w:color w:val="0B7A4B"/>
+                <w:color w:val="000000"/>
                 <w:sz w:val="19"/>
               </w:rPr>
               <w:t>Pass</w:t>
@@ -6445,7 +6445,7 @@
               <w:rPr>
                 <w:rFonts w:ascii="Calibri" w:hAnsi="Calibri"/>
                 <w:b/>
-                <w:color w:val="0B7A4B"/>
+                <w:color w:val="000000"/>
                 <w:sz w:val="19"/>
               </w:rPr>
               <w:t>Pass</w:t>
@@ -6554,7 +6554,7 @@
               <w:rPr>
                 <w:rFonts w:ascii="Calibri" w:hAnsi="Calibri"/>
                 <w:b/>
-                <w:color w:val="0B7A4B"/>
+                <w:color w:val="000000"/>
                 <w:sz w:val="19"/>
               </w:rPr>
               <w:t>Pass</w:t>
@@ -6663,7 +6663,7 @@
               <w:rPr>
                 <w:rFonts w:ascii="Calibri" w:hAnsi="Calibri"/>
                 <w:b/>
-                <w:color w:val="0B7A4B"/>
+                <w:color w:val="000000"/>
                 <w:sz w:val="19"/>
               </w:rPr>
               <w:t>Pass</w:t>
@@ -6772,7 +6772,7 @@
               <w:rPr>
                 <w:rFonts w:ascii="Calibri" w:hAnsi="Calibri"/>
                 <w:b/>
-                <w:color w:val="0B7A4B"/>
+                <w:color w:val="000000"/>
                 <w:sz w:val="19"/>
               </w:rPr>
               <w:t>Pass</w:t>
@@ -6881,7 +6881,7 @@
               <w:rPr>
                 <w:rFonts w:ascii="Calibri" w:hAnsi="Calibri"/>
                 <w:b/>
-                <w:color w:val="0B7A4B"/>
+                <w:color w:val="000000"/>
                 <w:sz w:val="19"/>
               </w:rPr>
               <w:t>Pass</w:t>
@@ -6990,7 +6990,7 @@
               <w:rPr>
                 <w:rFonts w:ascii="Calibri" w:hAnsi="Calibri"/>
                 <w:b/>
-                <w:color w:val="0B7A4B"/>
+                <w:color w:val="000000"/>
                 <w:sz w:val="19"/>
               </w:rPr>
               <w:t>Pass</w:t>
@@ -7099,7 +7099,7 @@
               <w:rPr>
                 <w:rFonts w:ascii="Calibri" w:hAnsi="Calibri"/>
                 <w:b/>
-                <w:color w:val="0B7A4B"/>
+                <w:color w:val="000000"/>
                 <w:sz w:val="19"/>
               </w:rPr>
               <w:t>Pass</w:t>
@@ -7208,7 +7208,7 @@
               <w:rPr>
                 <w:rFonts w:ascii="Calibri" w:hAnsi="Calibri"/>
                 <w:b/>
-                <w:color w:val="0B7A4B"/>
+                <w:color w:val="000000"/>
                 <w:sz w:val="19"/>
               </w:rPr>
               <w:t>Pass</w:t>
@@ -7317,7 +7317,7 @@
               <w:rPr>
                 <w:rFonts w:ascii="Calibri" w:hAnsi="Calibri"/>
                 <w:b/>
-                <w:color w:val="0B7A4B"/>
+                <w:color w:val="000000"/>
                 <w:sz w:val="19"/>
               </w:rPr>
               <w:t>Pass</w:t>
@@ -7426,7 +7426,7 @@
               <w:rPr>
                 <w:rFonts w:ascii="Calibri" w:hAnsi="Calibri"/>
                 <w:b/>
-                <w:color w:val="0B7A4B"/>
+                <w:color w:val="000000"/>
                 <w:sz w:val="19"/>
               </w:rPr>
               <w:t>Pass</w:t>
@@ -7535,7 +7535,7 @@
               <w:rPr>
                 <w:rFonts w:ascii="Calibri" w:hAnsi="Calibri"/>
                 <w:b/>
-                <w:color w:val="0B7A4B"/>
+                <w:color w:val="000000"/>
                 <w:sz w:val="19"/>
               </w:rPr>
               <w:t>Pass</w:t>
@@ -7644,7 +7644,7 @@
               <w:rPr>
                 <w:rFonts w:ascii="Calibri" w:hAnsi="Calibri"/>
                 <w:b/>
-                <w:color w:val="0B7A4B"/>
+                <w:color w:val="000000"/>
                 <w:sz w:val="19"/>
               </w:rPr>
               <w:t>Pass</w:t>
@@ -7753,7 +7753,7 @@
               <w:rPr>
                 <w:rFonts w:ascii="Calibri" w:hAnsi="Calibri"/>
                 <w:b/>
-                <w:color w:val="0B7A4B"/>
+                <w:color w:val="000000"/>
                 <w:sz w:val="19"/>
               </w:rPr>
               <w:t>Pass</w:t>
@@ -7862,7 +7862,7 @@
               <w:rPr>
                 <w:rFonts w:ascii="Calibri" w:hAnsi="Calibri"/>
                 <w:b/>
-                <w:color w:val="0B7A4B"/>
+                <w:color w:val="000000"/>
                 <w:sz w:val="19"/>
               </w:rPr>
               <w:t>Pass</w:t>
@@ -7971,7 +7971,7 @@
               <w:rPr>
                 <w:rFonts w:ascii="Calibri" w:hAnsi="Calibri"/>
                 <w:b/>
-                <w:color w:val="0B7A4B"/>
+                <w:color w:val="000000"/>
                 <w:sz w:val="19"/>
               </w:rPr>
               <w:t>Pass</w:t>
@@ -8080,7 +8080,7 @@
               <w:rPr>
                 <w:rFonts w:ascii="Calibri" w:hAnsi="Calibri"/>
                 <w:b/>
-                <w:color w:val="0B7A4B"/>
+                <w:color w:val="000000"/>
                 <w:sz w:val="19"/>
               </w:rPr>
               <w:t>Pass</w:t>
@@ -8189,7 +8189,7 @@
               <w:rPr>
                 <w:rFonts w:ascii="Calibri" w:hAnsi="Calibri"/>
                 <w:b/>
-                <w:color w:val="0B7A4B"/>
+                <w:color w:val="000000"/>
                 <w:sz w:val="19"/>
               </w:rPr>
               <w:t>Pass</w:t>
@@ -8204,7 +8204,7 @@
         <w:pStyle w:val="Heading3"/>
       </w:pPr>
       <w:r>
-        <w:t>5.3 HTML validation — W3C Nu Markup Validation Service</w:t>
+        <w:t>5.3 HTML validation: W3C Nu Markup Validation Service</w:t>
       </w:r>
     </w:p>
     <w:p>
@@ -8240,7 +8240,7 @@
         <w:tc>
           <w:tcPr>
             <w:tcW w:type="dxa" w:w="2412"/>
-            <w:shd w:val="clear" w:fill="F4F1FA"/>
+            <w:shd w:val="clear" w:fill="EFEFEF"/>
           </w:tcPr>
           <w:p>
             <w:pPr>
@@ -8259,7 +8259,7 @@
         <w:tc>
           <w:tcPr>
             <w:tcW w:type="dxa" w:w="2412"/>
-            <w:shd w:val="clear" w:fill="F4F1FA"/>
+            <w:shd w:val="clear" w:fill="EFEFEF"/>
           </w:tcPr>
           <w:p>
             <w:pPr>
@@ -8278,7 +8278,7 @@
         <w:tc>
           <w:tcPr>
             <w:tcW w:type="dxa" w:w="2412"/>
-            <w:shd w:val="clear" w:fill="F4F1FA"/>
+            <w:shd w:val="clear" w:fill="EFEFEF"/>
           </w:tcPr>
           <w:p>
             <w:pPr>
@@ -8297,7 +8297,7 @@
         <w:tc>
           <w:tcPr>
             <w:tcW w:type="dxa" w:w="2412"/>
-            <w:shd w:val="clear" w:fill="F4F1FA"/>
+            <w:shd w:val="clear" w:fill="EFEFEF"/>
           </w:tcPr>
           <w:p>
             <w:pPr>
@@ -8381,7 +8381,7 @@
               <w:rPr>
                 <w:rFonts w:ascii="Calibri" w:hAnsi="Calibri"/>
                 <w:b/>
-                <w:color w:val="0B7A4B"/>
+                <w:color w:val="000000"/>
                 <w:sz w:val="19"/>
               </w:rPr>
               <w:t>Pass</w:t>
@@ -8456,7 +8456,7 @@
               <w:rPr>
                 <w:rFonts w:ascii="Calibri" w:hAnsi="Calibri"/>
                 <w:b/>
-                <w:color w:val="0B7A4B"/>
+                <w:color w:val="000000"/>
                 <w:sz w:val="19"/>
               </w:rPr>
               <w:t>Pass</w:t>
@@ -8531,7 +8531,7 @@
               <w:rPr>
                 <w:rFonts w:ascii="Calibri" w:hAnsi="Calibri"/>
                 <w:b/>
-                <w:color w:val="0B7A4B"/>
+                <w:color w:val="000000"/>
                 <w:sz w:val="19"/>
               </w:rPr>
               <w:t>Pass</w:t>
@@ -8606,7 +8606,7 @@
               <w:rPr>
                 <w:rFonts w:ascii="Calibri" w:hAnsi="Calibri"/>
                 <w:b/>
-                <w:color w:val="0B7A4B"/>
+                <w:color w:val="000000"/>
                 <w:sz w:val="19"/>
               </w:rPr>
               <w:t>Pass</w:t>
@@ -8681,7 +8681,7 @@
               <w:rPr>
                 <w:rFonts w:ascii="Calibri" w:hAnsi="Calibri"/>
                 <w:b/>
-                <w:color w:val="0B7A4B"/>
+                <w:color w:val="000000"/>
                 <w:sz w:val="19"/>
               </w:rPr>
               <w:t>Pass</w:t>
@@ -8756,7 +8756,7 @@
               <w:rPr>
                 <w:rFonts w:ascii="Calibri" w:hAnsi="Calibri"/>
                 <w:b/>
-                <w:color w:val="0B7A4B"/>
+                <w:color w:val="000000"/>
                 <w:sz w:val="19"/>
               </w:rPr>
               <w:t>Pass</w:t>
@@ -8831,7 +8831,7 @@
               <w:rPr>
                 <w:rFonts w:ascii="Calibri" w:hAnsi="Calibri"/>
                 <w:b/>
-                <w:color w:val="0B7A4B"/>
+                <w:color w:val="000000"/>
                 <w:sz w:val="19"/>
               </w:rPr>
               <w:t>Pass</w:t>
@@ -8844,63 +8844,63 @@
     <w:p>
       <w:r>
         <w:rPr>
-          <w:color w:val="56545F"/>
+          <w:color w:val="000000"/>
         </w:rPr>
-        <w:t xml:space="preserve">Two issues were found and fixed during validation: an </w:t>
+        <w:t xml:space="preserve">Validation turned up two problems and both were fixed. An </w:t>
       </w:r>
       <w:r>
         <w:rPr>
           <w:rFonts w:ascii="Consolas" w:hAnsi="Consolas" w:cs="Consolas"/>
-          <w:color w:val="56545F"/>
+          <w:color w:val="000000"/>
           <w:sz w:val="19"/>
         </w:rPr>
         <w:t>&lt;aside&gt;</w:t>
       </w:r>
       <w:r>
         <w:rPr>
-          <w:color w:val="56545F"/>
+          <w:color w:val="000000"/>
         </w:rPr>
-        <w:t xml:space="preserve"> nested inside a section was changed to a titled </w:t>
+        <w:t xml:space="preserve"> was nested inside a section, so it became a titled </w:t>
       </w:r>
       <w:r>
         <w:rPr>
           <w:rFonts w:ascii="Consolas" w:hAnsi="Consolas" w:cs="Consolas"/>
-          <w:color w:val="56545F"/>
+          <w:color w:val="000000"/>
           <w:sz w:val="19"/>
         </w:rPr>
         <w:t>&lt;section&gt;</w:t>
       </w:r>
       <w:r>
         <w:rPr>
-          <w:color w:val="56545F"/>
+          <w:color w:val="000000"/>
         </w:rPr>
-        <w:t xml:space="preserve">, and the deprecated space-separated </w:t>
+        <w:t xml:space="preserve">, and the screen-reader utility still used the old space-separated </w:t>
       </w:r>
       <w:r>
         <w:rPr>
           <w:rFonts w:ascii="Consolas" w:hAnsi="Consolas" w:cs="Consolas"/>
-          <w:color w:val="56545F"/>
+          <w:color w:val="000000"/>
           <w:sz w:val="19"/>
         </w:rPr>
         <w:t>clip: rect(0 0 0 0)</w:t>
       </w:r>
       <w:r>
         <w:rPr>
-          <w:color w:val="56545F"/>
+          <w:color w:val="000000"/>
         </w:rPr>
-        <w:t xml:space="preserve"> shorthand in the screen-reader utility was rewritten with commas and paired with </w:t>
+        <w:t xml:space="preserve"> shorthand, which I rewrote with commas and paired with </w:t>
       </w:r>
       <w:r>
         <w:rPr>
           <w:rFonts w:ascii="Consolas" w:hAnsi="Consolas" w:cs="Consolas"/>
-          <w:color w:val="56545F"/>
+          <w:color w:val="000000"/>
           <w:sz w:val="19"/>
         </w:rPr>
         <w:t>clip-path</w:t>
       </w:r>
       <w:r>
         <w:rPr>
-          <w:color w:val="56545F"/>
+          <w:color w:val="000000"/>
         </w:rPr>
         <w:t xml:space="preserve">. </w:t>
       </w:r>
@@ -8910,7 +8910,7 @@
         <w:pStyle w:val="Heading3"/>
       </w:pPr>
       <w:r>
-        <w:t>5.4 CSS validation — W3C CSS Validation Service</w:t>
+        <w:t>5.4 CSS validation: W3C CSS Validation Service</w:t>
       </w:r>
     </w:p>
     <w:p>
@@ -8946,7 +8946,7 @@
         <w:tc>
           <w:tcPr>
             <w:tcW w:type="dxa" w:w="2412"/>
-            <w:shd w:val="clear" w:fill="F4F1FA"/>
+            <w:shd w:val="clear" w:fill="EFEFEF"/>
           </w:tcPr>
           <w:p>
             <w:pPr>
@@ -8965,7 +8965,7 @@
         <w:tc>
           <w:tcPr>
             <w:tcW w:type="dxa" w:w="2412"/>
-            <w:shd w:val="clear" w:fill="F4F1FA"/>
+            <w:shd w:val="clear" w:fill="EFEFEF"/>
           </w:tcPr>
           <w:p>
             <w:pPr>
@@ -8984,7 +8984,7 @@
         <w:tc>
           <w:tcPr>
             <w:tcW w:type="dxa" w:w="2412"/>
-            <w:shd w:val="clear" w:fill="F4F1FA"/>
+            <w:shd w:val="clear" w:fill="EFEFEF"/>
           </w:tcPr>
           <w:p>
             <w:pPr>
@@ -9003,7 +9003,7 @@
         <w:tc>
           <w:tcPr>
             <w:tcW w:type="dxa" w:w="2412"/>
-            <w:shd w:val="clear" w:fill="F4F1FA"/>
+            <w:shd w:val="clear" w:fill="EFEFEF"/>
           </w:tcPr>
           <w:p>
             <w:pPr>
@@ -9087,7 +9087,7 @@
               <w:rPr>
                 <w:rFonts w:ascii="Calibri" w:hAnsi="Calibri"/>
                 <w:b/>
-                <w:color w:val="0B7A4B"/>
+                <w:color w:val="000000"/>
                 <w:sz w:val="19"/>
               </w:rPr>
               <w:t>Pass</w:t>
@@ -9162,7 +9162,7 @@
               <w:rPr>
                 <w:rFonts w:ascii="Calibri" w:hAnsi="Calibri"/>
                 <w:b/>
-                <w:color w:val="0B7A4B"/>
+                <w:color w:val="000000"/>
                 <w:sz w:val="19"/>
               </w:rPr>
               <w:t>Pass</w:t>
@@ -9237,7 +9237,7 @@
               <w:rPr>
                 <w:rFonts w:ascii="Calibri" w:hAnsi="Calibri"/>
                 <w:b/>
-                <w:color w:val="0B7A4B"/>
+                <w:color w:val="000000"/>
                 <w:sz w:val="19"/>
               </w:rPr>
               <w:t>Pass</w:t>
@@ -9250,23 +9250,187 @@
     <w:p>
       <w:r>
         <w:rPr>
-          <w:color w:val="56545F"/>
+          <w:color w:val="000000"/>
         </w:rPr>
-        <w:t xml:space="preserve">The warnings are informational: the validator cannot resolve the value of a CSS custom property at validation time, so it reports one warning for each use. The only other warning is the </w:t>
+        <w:t xml:space="preserve">The warnings are informational. The validator cannot work out the value of a CSS custom property while it is checking, so it raises one warning for every use. The only other warning is the </w:t>
       </w:r>
       <w:r>
         <w:rPr>
           <w:rFonts w:ascii="Consolas" w:hAnsi="Consolas" w:cs="Consolas"/>
-          <w:color w:val="56545F"/>
+          <w:color w:val="000000"/>
           <w:sz w:val="19"/>
         </w:rPr>
         <w:t>-webkit-text-size-adjust</w:t>
       </w:r>
       <w:r>
         <w:rPr>
-          <w:color w:val="56545F"/>
+          <w:color w:val="000000"/>
         </w:rPr>
-        <w:t xml:space="preserve"> vendor prefix, which is kept deliberately to stop iOS Safari inflating text in landscape. </w:t>
+        <w:t xml:space="preserve"> prefix, which I kept on purpose to stop iOS Safari inflating text in landscape. </w:t>
+      </w:r>
+    </w:p>
+    <w:p>
+      <w:r>
+        <w:t xml:space="preserve">The result pages for all three stylesheets are below, taken from the deployed site rather than from local copies. </w:t>
+      </w:r>
+    </w:p>
+    <w:p>
+      <w:pPr>
+        <w:jc w:val="center"/>
+      </w:pPr>
+      <w:r>
+        <w:drawing>
+          <wp:inline xmlns:a="http://schemas.openxmlformats.org/drawingml/2006/main" xmlns:pic="http://schemas.openxmlformats.org/drawingml/2006/picture">
+            <wp:extent cx="6126480" cy="2119762"/>
+            <wp:docPr id="7" name="Picture 7"/>
+            <wp:cNvGraphicFramePr>
+              <a:graphicFrameLocks noChangeAspect="1"/>
+            </wp:cNvGraphicFramePr>
+            <a:graphic>
+              <a:graphicData uri="http://schemas.openxmlformats.org/drawingml/2006/picture">
+                <pic:pic>
+                  <pic:nvPicPr>
+                    <pic:cNvPr id="0" name="css-base.png"/>
+                    <pic:cNvPicPr/>
+                  </pic:nvPicPr>
+                  <pic:blipFill>
+                    <a:blip r:embed="rId17"/>
+                    <a:stretch>
+                      <a:fillRect/>
+                    </a:stretch>
+                  </pic:blipFill>
+                  <pic:spPr>
+                    <a:xfrm>
+                      <a:off x="0" y="0"/>
+                      <a:ext cx="6126480" cy="2119762"/>
+                    </a:xfrm>
+                    <a:prstGeom prst="rect"/>
+                  </pic:spPr>
+                </pic:pic>
+              </a:graphicData>
+            </a:graphic>
+          </wp:inline>
+        </w:drawing>
+      </w:r>
+    </w:p>
+    <w:p>
+      <w:pPr>
+        <w:spacing w:after="280"/>
+        <w:jc w:val="center"/>
+      </w:pPr>
+      <w:r>
+        <w:rPr>
+          <w:i/>
+          <w:color w:val="000000"/>
+          <w:sz w:val="18"/>
+        </w:rPr>
+        <w:t>W3C CSS Validation Service result for base.css: no errors found</w:t>
+      </w:r>
+    </w:p>
+    <w:p>
+      <w:pPr>
+        <w:jc w:val="center"/>
+      </w:pPr>
+      <w:r>
+        <w:drawing>
+          <wp:inline xmlns:a="http://schemas.openxmlformats.org/drawingml/2006/main" xmlns:pic="http://schemas.openxmlformats.org/drawingml/2006/picture">
+            <wp:extent cx="6126480" cy="2119762"/>
+            <wp:docPr id="8" name="Picture 8"/>
+            <wp:cNvGraphicFramePr>
+              <a:graphicFrameLocks noChangeAspect="1"/>
+            </wp:cNvGraphicFramePr>
+            <a:graphic>
+              <a:graphicData uri="http://schemas.openxmlformats.org/drawingml/2006/picture">
+                <pic:pic>
+                  <pic:nvPicPr>
+                    <pic:cNvPr id="0" name="css-components.png"/>
+                    <pic:cNvPicPr/>
+                  </pic:nvPicPr>
+                  <pic:blipFill>
+                    <a:blip r:embed="rId18"/>
+                    <a:stretch>
+                      <a:fillRect/>
+                    </a:stretch>
+                  </pic:blipFill>
+                  <pic:spPr>
+                    <a:xfrm>
+                      <a:off x="0" y="0"/>
+                      <a:ext cx="6126480" cy="2119762"/>
+                    </a:xfrm>
+                    <a:prstGeom prst="rect"/>
+                  </pic:spPr>
+                </pic:pic>
+              </a:graphicData>
+            </a:graphic>
+          </wp:inline>
+        </w:drawing>
+      </w:r>
+    </w:p>
+    <w:p>
+      <w:pPr>
+        <w:spacing w:after="280"/>
+        <w:jc w:val="center"/>
+      </w:pPr>
+      <w:r>
+        <w:rPr>
+          <w:i/>
+          <w:color w:val="000000"/>
+          <w:sz w:val="18"/>
+        </w:rPr>
+        <w:t>W3C CSS Validation Service result for components.css: no errors found</w:t>
+      </w:r>
+    </w:p>
+    <w:p>
+      <w:pPr>
+        <w:jc w:val="center"/>
+      </w:pPr>
+      <w:r>
+        <w:drawing>
+          <wp:inline xmlns:a="http://schemas.openxmlformats.org/drawingml/2006/main" xmlns:pic="http://schemas.openxmlformats.org/drawingml/2006/picture">
+            <wp:extent cx="6126480" cy="2119762"/>
+            <wp:docPr id="9" name="Picture 9"/>
+            <wp:cNvGraphicFramePr>
+              <a:graphicFrameLocks noChangeAspect="1"/>
+            </wp:cNvGraphicFramePr>
+            <a:graphic>
+              <a:graphicData uri="http://schemas.openxmlformats.org/drawingml/2006/picture">
+                <pic:pic>
+                  <pic:nvPicPr>
+                    <pic:cNvPr id="0" name="css-pages.png"/>
+                    <pic:cNvPicPr/>
+                  </pic:nvPicPr>
+                  <pic:blipFill>
+                    <a:blip r:embed="rId19"/>
+                    <a:stretch>
+                      <a:fillRect/>
+                    </a:stretch>
+                  </pic:blipFill>
+                  <pic:spPr>
+                    <a:xfrm>
+                      <a:off x="0" y="0"/>
+                      <a:ext cx="6126480" cy="2119762"/>
+                    </a:xfrm>
+                    <a:prstGeom prst="rect"/>
+                  </pic:spPr>
+                </pic:pic>
+              </a:graphicData>
+            </a:graphic>
+          </wp:inline>
+        </w:drawing>
+      </w:r>
+    </w:p>
+    <w:p>
+      <w:pPr>
+        <w:spacing w:after="280"/>
+        <w:jc w:val="center"/>
+      </w:pPr>
+      <w:r>
+        <w:rPr>
+          <w:i/>
+          <w:color w:val="000000"/>
+          <w:sz w:val="18"/>
+        </w:rPr>
+        <w:t>W3C CSS Validation Service result for pages.css: no errors found</w:t>
       </w:r>
     </w:p>
     <w:p>
@@ -9274,7 +9438,7 @@
         <w:pStyle w:val="Heading3"/>
       </w:pPr>
       <w:r>
-        <w:t>5.5 Accessibility — WAVE and axe-core</w:t>
+        <w:t>5.5 Accessibility: WAVE and axe-core</w:t>
       </w:r>
     </w:p>
     <w:p>
@@ -9310,7 +9474,7 @@
         <w:tc>
           <w:tcPr>
             <w:tcW w:type="dxa" w:w="2412"/>
-            <w:shd w:val="clear" w:fill="F4F1FA"/>
+            <w:shd w:val="clear" w:fill="EFEFEF"/>
           </w:tcPr>
           <w:p>
             <w:pPr>
@@ -9329,7 +9493,7 @@
         <w:tc>
           <w:tcPr>
             <w:tcW w:type="dxa" w:w="2412"/>
-            <w:shd w:val="clear" w:fill="F4F1FA"/>
+            <w:shd w:val="clear" w:fill="EFEFEF"/>
           </w:tcPr>
           <w:p>
             <w:pPr>
@@ -9348,7 +9512,7 @@
         <w:tc>
           <w:tcPr>
             <w:tcW w:type="dxa" w:w="2412"/>
-            <w:shd w:val="clear" w:fill="F4F1FA"/>
+            <w:shd w:val="clear" w:fill="EFEFEF"/>
           </w:tcPr>
           <w:p>
             <w:pPr>
@@ -9367,7 +9531,7 @@
         <w:tc>
           <w:tcPr>
             <w:tcW w:type="dxa" w:w="2412"/>
-            <w:shd w:val="clear" w:fill="F4F1FA"/>
+            <w:shd w:val="clear" w:fill="EFEFEF"/>
           </w:tcPr>
           <w:p>
             <w:pPr>
@@ -9451,7 +9615,7 @@
               <w:rPr>
                 <w:rFonts w:ascii="Calibri" w:hAnsi="Calibri"/>
                 <w:b/>
-                <w:color w:val="0B7A4B"/>
+                <w:color w:val="000000"/>
                 <w:sz w:val="19"/>
               </w:rPr>
               <w:t>Pass</w:t>
@@ -9526,7 +9690,7 @@
               <w:rPr>
                 <w:rFonts w:ascii="Calibri" w:hAnsi="Calibri"/>
                 <w:b/>
-                <w:color w:val="0B7A4B"/>
+                <w:color w:val="000000"/>
                 <w:sz w:val="19"/>
               </w:rPr>
               <w:t>Pass</w:t>
@@ -9601,7 +9765,7 @@
               <w:rPr>
                 <w:rFonts w:ascii="Calibri" w:hAnsi="Calibri"/>
                 <w:b/>
-                <w:color w:val="0B7A4B"/>
+                <w:color w:val="000000"/>
                 <w:sz w:val="19"/>
               </w:rPr>
               <w:t>Pass</w:t>
@@ -9676,7 +9840,7 @@
               <w:rPr>
                 <w:rFonts w:ascii="Calibri" w:hAnsi="Calibri"/>
                 <w:b/>
-                <w:color w:val="0B7A4B"/>
+                <w:color w:val="000000"/>
                 <w:sz w:val="19"/>
               </w:rPr>
               <w:t>Pass</w:t>
@@ -9751,7 +9915,7 @@
               <w:rPr>
                 <w:rFonts w:ascii="Calibri" w:hAnsi="Calibri"/>
                 <w:b/>
-                <w:color w:val="0B7A4B"/>
+                <w:color w:val="000000"/>
                 <w:sz w:val="19"/>
               </w:rPr>
               <w:t>Pass</w:t>
@@ -9826,7 +9990,7 @@
               <w:rPr>
                 <w:rFonts w:ascii="Calibri" w:hAnsi="Calibri"/>
                 <w:b/>
-                <w:color w:val="0B7A4B"/>
+                <w:color w:val="000000"/>
                 <w:sz w:val="19"/>
               </w:rPr>
               <w:t>Pass</w:t>
@@ -9838,7 +10002,7 @@
     <w:p/>
     <w:p>
       <w:r>
-        <w:t>Accessibility work that produced those results:</w:t>
+        <w:t>The accessibility work behind those results:</w:t>
       </w:r>
     </w:p>
     <w:p>
@@ -10091,7 +10255,7 @@
         <w:tc>
           <w:tcPr>
             <w:tcW w:type="dxa" w:w="1072"/>
-            <w:shd w:val="clear" w:fill="F4F1FA"/>
+            <w:shd w:val="clear" w:fill="EFEFEF"/>
           </w:tcPr>
           <w:p>
             <w:pPr>
@@ -10110,7 +10274,7 @@
         <w:tc>
           <w:tcPr>
             <w:tcW w:type="dxa" w:w="1072"/>
-            <w:shd w:val="clear" w:fill="F4F1FA"/>
+            <w:shd w:val="clear" w:fill="EFEFEF"/>
           </w:tcPr>
           <w:p>
             <w:pPr>
@@ -10129,7 +10293,7 @@
         <w:tc>
           <w:tcPr>
             <w:tcW w:type="dxa" w:w="1072"/>
-            <w:shd w:val="clear" w:fill="F4F1FA"/>
+            <w:shd w:val="clear" w:fill="EFEFEF"/>
           </w:tcPr>
           <w:p>
             <w:pPr>
@@ -10214,7 +10378,7 @@
         <w:tc>
           <w:tcPr>
             <w:tcW w:type="dxa" w:w="1072"/>
-            <w:shd w:val="clear" w:fill="F4F1FA"/>
+            <w:shd w:val="clear" w:fill="EFEFEF"/>
           </w:tcPr>
           <w:p>
             <w:pPr>
@@ -10233,7 +10397,7 @@
         <w:tc>
           <w:tcPr>
             <w:tcW w:type="dxa" w:w="1072"/>
-            <w:shd w:val="clear" w:fill="F4F1FA"/>
+            <w:shd w:val="clear" w:fill="EFEFEF"/>
           </w:tcPr>
           <w:p>
             <w:pPr>
@@ -10252,7 +10416,7 @@
         <w:tc>
           <w:tcPr>
             <w:tcW w:type="dxa" w:w="1072"/>
-            <w:shd w:val="clear" w:fill="F4F1FA"/>
+            <w:shd w:val="clear" w:fill="EFEFEF"/>
           </w:tcPr>
           <w:p>
             <w:pPr>
@@ -10271,7 +10435,7 @@
         <w:tc>
           <w:tcPr>
             <w:tcW w:type="dxa" w:w="1072"/>
-            <w:shd w:val="clear" w:fill="F4F1FA"/>
+            <w:shd w:val="clear" w:fill="EFEFEF"/>
           </w:tcPr>
           <w:p>
             <w:pPr>
@@ -10290,7 +10454,7 @@
         <w:tc>
           <w:tcPr>
             <w:tcW w:type="dxa" w:w="1072"/>
-            <w:shd w:val="clear" w:fill="F4F1FA"/>
+            <w:shd w:val="clear" w:fill="EFEFEF"/>
           </w:tcPr>
           <w:p>
             <w:pPr>
@@ -10309,7 +10473,7 @@
         <w:tc>
           <w:tcPr>
             <w:tcW w:type="dxa" w:w="1072"/>
-            <w:shd w:val="clear" w:fill="F4F1FA"/>
+            <w:shd w:val="clear" w:fill="EFEFEF"/>
           </w:tcPr>
           <w:p>
             <w:pPr>
@@ -10328,7 +10492,7 @@
         <w:tc>
           <w:tcPr>
             <w:tcW w:type="dxa" w:w="1072"/>
-            <w:shd w:val="clear" w:fill="F4F1FA"/>
+            <w:shd w:val="clear" w:fill="EFEFEF"/>
           </w:tcPr>
           <w:p>
             <w:pPr>
@@ -10347,7 +10511,7 @@
         <w:tc>
           <w:tcPr>
             <w:tcW w:type="dxa" w:w="1072"/>
-            <w:shd w:val="clear" w:fill="F4F1FA"/>
+            <w:shd w:val="clear" w:fill="EFEFEF"/>
           </w:tcPr>
           <w:p>
             <w:pPr>
@@ -11326,7 +11490,7 @@
     <w:p/>
     <w:p>
       <w:r>
-        <w:t>All audits were run with Lighthouse 12.8 in headless Chrome. The first audit scored 84 on mobile. Three changes brought it to 99–100:</w:t>
+        <w:t>Every audit was run with Lighthouse 12.8 in headless Chrome. My first run scored 84 on mobile. Three changes took it to 99–100:</w:t>
       </w:r>
     </w:p>
     <w:p>
@@ -11427,7 +11591,7 @@
         <w:tc>
           <w:tcPr>
             <w:tcW w:type="dxa" w:w="1930"/>
-            <w:shd w:val="clear" w:fill="F4F1FA"/>
+            <w:shd w:val="clear" w:fill="EFEFEF"/>
           </w:tcPr>
           <w:p>
             <w:pPr>
@@ -11446,7 +11610,7 @@
         <w:tc>
           <w:tcPr>
             <w:tcW w:type="dxa" w:w="1930"/>
-            <w:shd w:val="clear" w:fill="F4F1FA"/>
+            <w:shd w:val="clear" w:fill="EFEFEF"/>
           </w:tcPr>
           <w:p>
             <w:pPr>
@@ -11465,7 +11629,7 @@
         <w:tc>
           <w:tcPr>
             <w:tcW w:type="dxa" w:w="1930"/>
-            <w:shd w:val="clear" w:fill="F4F1FA"/>
+            <w:shd w:val="clear" w:fill="EFEFEF"/>
           </w:tcPr>
           <w:p>
             <w:pPr>
@@ -11484,7 +11648,7 @@
         <w:tc>
           <w:tcPr>
             <w:tcW w:type="dxa" w:w="1930"/>
-            <w:shd w:val="clear" w:fill="F4F1FA"/>
+            <w:shd w:val="clear" w:fill="EFEFEF"/>
           </w:tcPr>
           <w:p>
             <w:pPr>
@@ -11503,7 +11667,7 @@
         <w:tc>
           <w:tcPr>
             <w:tcW w:type="dxa" w:w="1930"/>
-            <w:shd w:val="clear" w:fill="F4F1FA"/>
+            <w:shd w:val="clear" w:fill="EFEFEF"/>
           </w:tcPr>
           <w:p>
             <w:pPr>
@@ -11705,9 +11869,9 @@
     <w:p>
       <w:r>
         <w:rPr>
-          <w:color w:val="56545F"/>
+          <w:color w:val="000000"/>
         </w:rPr>
-        <w:t xml:space="preserve">Live performance is a few points lower than the local audit purely because of network latency: Lighthouse measured a 900 ms server response for the first request and GitHub Pages sets a ten-minute cache lifetime, neither of which can be changed from the site’s code. Total blocking time is 0 ms and cumulative layout shift is 0.029 on both presets. </w:t>
+        <w:t xml:space="preserve">The live scores sit a few points below the local ones because of network latency and nothing else. Lighthouse measured a 900 ms server response on the first request, and GitHub Pages sets a ten-minute cache lifetime; neither can be changed from the site’s own code. Total blocking time is 0 ms and cumulative layout shift is 0.029 on both presets. </w:t>
       </w:r>
     </w:p>
     <w:p>
@@ -11751,7 +11915,7 @@
         <w:tc>
           <w:tcPr>
             <w:tcW w:type="dxa" w:w="2412"/>
-            <w:shd w:val="clear" w:fill="F4F1FA"/>
+            <w:shd w:val="clear" w:fill="EFEFEF"/>
           </w:tcPr>
           <w:p>
             <w:pPr>
@@ -11770,7 +11934,7 @@
         <w:tc>
           <w:tcPr>
             <w:tcW w:type="dxa" w:w="2412"/>
-            <w:shd w:val="clear" w:fill="F4F1FA"/>
+            <w:shd w:val="clear" w:fill="EFEFEF"/>
           </w:tcPr>
           <w:p>
             <w:pPr>
@@ -11789,7 +11953,7 @@
         <w:tc>
           <w:tcPr>
             <w:tcW w:type="dxa" w:w="2412"/>
-            <w:shd w:val="clear" w:fill="F4F1FA"/>
+            <w:shd w:val="clear" w:fill="EFEFEF"/>
           </w:tcPr>
           <w:p>
             <w:pPr>
@@ -11808,7 +11972,7 @@
         <w:tc>
           <w:tcPr>
             <w:tcW w:type="dxa" w:w="2412"/>
-            <w:shd w:val="clear" w:fill="F4F1FA"/>
+            <w:shd w:val="clear" w:fill="EFEFEF"/>
           </w:tcPr>
           <w:p>
             <w:pPr>
@@ -11892,7 +12056,7 @@
               <w:rPr>
                 <w:rFonts w:ascii="Calibri" w:hAnsi="Calibri"/>
                 <w:b/>
-                <w:color w:val="0B7A4B"/>
+                <w:color w:val="000000"/>
                 <w:sz w:val="19"/>
               </w:rPr>
               <w:t>Pass</w:t>
@@ -11967,7 +12131,7 @@
               <w:rPr>
                 <w:rFonts w:ascii="Calibri" w:hAnsi="Calibri"/>
                 <w:b/>
-                <w:color w:val="0B7A4B"/>
+                <w:color w:val="000000"/>
                 <w:sz w:val="19"/>
               </w:rPr>
               <w:t>Pass</w:t>
@@ -12042,7 +12206,7 @@
               <w:rPr>
                 <w:rFonts w:ascii="Calibri" w:hAnsi="Calibri"/>
                 <w:b/>
-                <w:color w:val="0B7A4B"/>
+                <w:color w:val="000000"/>
                 <w:sz w:val="19"/>
               </w:rPr>
               <w:t>Pass</w:t>
@@ -12117,7 +12281,7 @@
               <w:rPr>
                 <w:rFonts w:ascii="Calibri" w:hAnsi="Calibri"/>
                 <w:b/>
-                <w:color w:val="0B7A4B"/>
+                <w:color w:val="000000"/>
                 <w:sz w:val="19"/>
               </w:rPr>
               <w:t>Pass</w:t>
@@ -12192,7 +12356,7 @@
               <w:rPr>
                 <w:rFonts w:ascii="Calibri" w:hAnsi="Calibri"/>
                 <w:b/>
-                <w:color w:val="0B7A4B"/>
+                <w:color w:val="000000"/>
                 <w:sz w:val="19"/>
               </w:rPr>
               <w:t>Pass</w:t>
@@ -12267,7 +12431,7 @@
               <w:rPr>
                 <w:rFonts w:ascii="Calibri" w:hAnsi="Calibri"/>
                 <w:b/>
-                <w:color w:val="0B7A4B"/>
+                <w:color w:val="000000"/>
                 <w:sz w:val="19"/>
               </w:rPr>
               <w:t>Pass</w:t>
@@ -12317,7 +12481,7 @@
         <w:tc>
           <w:tcPr>
             <w:tcW w:type="dxa" w:w="3216"/>
-            <w:shd w:val="clear" w:fill="F4F1FA"/>
+            <w:shd w:val="clear" w:fill="EFEFEF"/>
           </w:tcPr>
           <w:p>
             <w:pPr>
@@ -12336,7 +12500,7 @@
         <w:tc>
           <w:tcPr>
             <w:tcW w:type="dxa" w:w="3216"/>
-            <w:shd w:val="clear" w:fill="F4F1FA"/>
+            <w:shd w:val="clear" w:fill="EFEFEF"/>
           </w:tcPr>
           <w:p>
             <w:pPr>
@@ -12355,7 +12519,7 @@
         <w:tc>
           <w:tcPr>
             <w:tcW w:type="dxa" w:w="3216"/>
-            <w:shd w:val="clear" w:fill="F4F1FA"/>
+            <w:shd w:val="clear" w:fill="EFEFEF"/>
           </w:tcPr>
           <w:p>
             <w:pPr>
@@ -12422,7 +12586,7 @@
               <w:rPr>
                 <w:rFonts w:ascii="Calibri" w:hAnsi="Calibri"/>
                 <w:b/>
-                <w:color w:val="0B7A4B"/>
+                <w:color w:val="000000"/>
                 <w:sz w:val="19"/>
               </w:rPr>
               <w:t>Pass</w:t>
@@ -12487,7 +12651,7 @@
               <w:rPr>
                 <w:rFonts w:ascii="Calibri" w:hAnsi="Calibri"/>
                 <w:b/>
-                <w:color w:val="0B7A4B"/>
+                <w:color w:val="000000"/>
                 <w:sz w:val="19"/>
               </w:rPr>
               <w:t>Pass</w:t>
@@ -12545,7 +12709,7 @@
               <w:rPr>
                 <w:rFonts w:ascii="Calibri" w:hAnsi="Calibri"/>
                 <w:b/>
-                <w:color w:val="0B7A4B"/>
+                <w:color w:val="000000"/>
                 <w:sz w:val="19"/>
               </w:rPr>
               <w:t>Pass</w:t>
@@ -12610,7 +12774,7 @@
               <w:rPr>
                 <w:rFonts w:ascii="Calibri" w:hAnsi="Calibri"/>
                 <w:b/>
-                <w:color w:val="0B7A4B"/>
+                <w:color w:val="000000"/>
                 <w:sz w:val="19"/>
               </w:rPr>
               <w:t>Pass</w:t>
@@ -12668,10 +12832,763 @@
               <w:rPr>
                 <w:rFonts w:ascii="Calibri" w:hAnsi="Calibri"/>
                 <w:b/>
-                <w:color w:val="0B7A4B"/>
+                <w:color w:val="000000"/>
                 <w:sz w:val="19"/>
               </w:rPr>
               <w:t>Pass</w:t>
+            </w:r>
+          </w:p>
+        </w:tc>
+      </w:tr>
+    </w:tbl>
+    <w:p/>
+    <w:p>
+      <w:pPr>
+        <w:pStyle w:val="Heading3"/>
+      </w:pPr>
+      <w:r>
+        <w:t>5.9 Screenshots of the finished site</w:t>
+      </w:r>
+    </w:p>
+    <w:p>
+      <w:r>
+        <w:t xml:space="preserve">The screenshots below were taken from the finished site in Chrome at two window widths, 390px and 1280px, with nothing changed between the two apart from the width of the window. They are the evidence behind the responsiveness table above: the same markup produces a single column with a hamburger menu on a phone and a multi-column layout on a desktop. </w:t>
+      </w:r>
+    </w:p>
+    <w:p>
+      <w:pPr>
+        <w:keepNext/>
+        <w:spacing w:after="80"/>
+      </w:pPr>
+      <w:r>
+        <w:rPr>
+          <w:b/>
+        </w:rPr>
+        <w:t>Every page at 390px (left) and at 1280px (right)</w:t>
+      </w:r>
+    </w:p>
+    <w:tbl>
+      <w:tblPr>
+        <w:tblStyle w:val="TableGrid"/>
+        <w:tblW w:type="auto" w:w="0"/>
+        <w:tblLayout w:type="autofit"/>
+        <w:tblLook w:firstColumn="1" w:firstRow="1" w:lastColumn="0" w:lastRow="0" w:noHBand="0" w:noVBand="1" w:val="04A0"/>
+      </w:tblPr>
+      <w:tblGrid>
+        <w:gridCol w:w="3216"/>
+        <w:gridCol w:w="3216"/>
+        <w:gridCol w:w="3216"/>
+      </w:tblGrid>
+      <w:tr>
+        <w:trPr>
+          <w:cantSplit/>
+        </w:trPr>
+        <w:tc>
+          <w:tcPr>
+            <w:tcW w:type="dxa" w:w="3216"/>
+          </w:tcPr>
+          <w:p>
+            <w:pPr>
+              <w:spacing w:after="40" w:before="40" w:line="240" w:lineRule="auto"/>
+            </w:pPr>
+            <w:r>
+              <w:rPr>
+                <w:rFonts w:ascii="Calibri" w:hAnsi="Calibri"/>
+                <w:b/>
+                <w:sz w:val="19"/>
+              </w:rPr>
+              <w:t>Home</w:t>
+            </w:r>
+          </w:p>
+        </w:tc>
+        <w:tc>
+          <w:tcPr>
+            <w:tcW w:type="dxa" w:w="3216"/>
+          </w:tcPr>
+          <w:p>
+            <w:pPr>
+              <w:spacing w:after="40" w:before="40" w:line="240" w:lineRule="auto"/>
+            </w:pPr>
+            <w:r>
+              <w:rPr>
+                <w:rFonts w:ascii="Calibri" w:hAnsi="Calibri"/>
+                <w:sz w:val="19"/>
+              </w:rPr>
+              <w:drawing>
+                <wp:inline xmlns:a="http://schemas.openxmlformats.org/drawingml/2006/main" xmlns:pic="http://schemas.openxmlformats.org/drawingml/2006/picture">
+                  <wp:extent cx="1371600" cy="2967228"/>
+                  <wp:docPr id="10" name="Picture 10"/>
+                  <wp:cNvGraphicFramePr>
+                    <a:graphicFrameLocks noChangeAspect="1"/>
+                  </wp:cNvGraphicFramePr>
+                  <a:graphic>
+                    <a:graphicData uri="http://schemas.openxmlformats.org/drawingml/2006/picture">
+                      <pic:pic>
+                        <pic:nvPicPr>
+                          <pic:cNvPr id="0" name="index-mobile.png"/>
+                          <pic:cNvPicPr/>
+                        </pic:nvPicPr>
+                        <pic:blipFill>
+                          <a:blip r:embed="rId20"/>
+                          <a:stretch>
+                            <a:fillRect/>
+                          </a:stretch>
+                        </pic:blipFill>
+                        <pic:spPr>
+                          <a:xfrm>
+                            <a:off x="0" y="0"/>
+                            <a:ext cx="1371600" cy="2967228"/>
+                          </a:xfrm>
+                          <a:prstGeom prst="rect"/>
+                        </pic:spPr>
+                      </pic:pic>
+                    </a:graphicData>
+                  </a:graphic>
+                </wp:inline>
+              </w:drawing>
+            </w:r>
+          </w:p>
+        </w:tc>
+        <w:tc>
+          <w:tcPr>
+            <w:tcW w:type="dxa" w:w="3216"/>
+          </w:tcPr>
+          <w:p>
+            <w:pPr>
+              <w:spacing w:after="40" w:before="40" w:line="240" w:lineRule="auto"/>
+            </w:pPr>
+            <w:r>
+              <w:rPr>
+                <w:rFonts w:ascii="Calibri" w:hAnsi="Calibri"/>
+                <w:sz w:val="19"/>
+              </w:rPr>
+              <w:drawing>
+                <wp:inline xmlns:a="http://schemas.openxmlformats.org/drawingml/2006/main" xmlns:pic="http://schemas.openxmlformats.org/drawingml/2006/picture">
+                  <wp:extent cx="3566160" cy="2394082"/>
+                  <wp:docPr id="11" name="Picture 11"/>
+                  <wp:cNvGraphicFramePr>
+                    <a:graphicFrameLocks noChangeAspect="1"/>
+                  </wp:cNvGraphicFramePr>
+                  <a:graphic>
+                    <a:graphicData uri="http://schemas.openxmlformats.org/drawingml/2006/picture">
+                      <pic:pic>
+                        <pic:nvPicPr>
+                          <pic:cNvPr id="0" name="index-desktop.png"/>
+                          <pic:cNvPicPr/>
+                        </pic:nvPicPr>
+                        <pic:blipFill>
+                          <a:blip r:embed="rId21"/>
+                          <a:stretch>
+                            <a:fillRect/>
+                          </a:stretch>
+                        </pic:blipFill>
+                        <pic:spPr>
+                          <a:xfrm>
+                            <a:off x="0" y="0"/>
+                            <a:ext cx="3566160" cy="2394082"/>
+                          </a:xfrm>
+                          <a:prstGeom prst="rect"/>
+                        </pic:spPr>
+                      </pic:pic>
+                    </a:graphicData>
+                  </a:graphic>
+                </wp:inline>
+              </w:drawing>
+            </w:r>
+          </w:p>
+        </w:tc>
+      </w:tr>
+      <w:tr>
+        <w:trPr>
+          <w:cantSplit/>
+        </w:trPr>
+        <w:tc>
+          <w:tcPr>
+            <w:tcW w:type="dxa" w:w="3216"/>
+          </w:tcPr>
+          <w:p>
+            <w:pPr>
+              <w:spacing w:after="40" w:before="40" w:line="240" w:lineRule="auto"/>
+            </w:pPr>
+            <w:r>
+              <w:rPr>
+                <w:rFonts w:ascii="Calibri" w:hAnsi="Calibri"/>
+                <w:b/>
+                <w:sz w:val="19"/>
+              </w:rPr>
+              <w:t>Products</w:t>
+            </w:r>
+          </w:p>
+        </w:tc>
+        <w:tc>
+          <w:tcPr>
+            <w:tcW w:type="dxa" w:w="3216"/>
+          </w:tcPr>
+          <w:p>
+            <w:pPr>
+              <w:spacing w:after="40" w:before="40" w:line="240" w:lineRule="auto"/>
+            </w:pPr>
+            <w:r>
+              <w:rPr>
+                <w:rFonts w:ascii="Calibri" w:hAnsi="Calibri"/>
+                <w:sz w:val="19"/>
+              </w:rPr>
+              <w:drawing>
+                <wp:inline xmlns:a="http://schemas.openxmlformats.org/drawingml/2006/main" xmlns:pic="http://schemas.openxmlformats.org/drawingml/2006/picture">
+                  <wp:extent cx="1371600" cy="2967228"/>
+                  <wp:docPr id="12" name="Picture 12"/>
+                  <wp:cNvGraphicFramePr>
+                    <a:graphicFrameLocks noChangeAspect="1"/>
+                  </wp:cNvGraphicFramePr>
+                  <a:graphic>
+                    <a:graphicData uri="http://schemas.openxmlformats.org/drawingml/2006/picture">
+                      <pic:pic>
+                        <pic:nvPicPr>
+                          <pic:cNvPr id="0" name="products-mobile.png"/>
+                          <pic:cNvPicPr/>
+                        </pic:nvPicPr>
+                        <pic:blipFill>
+                          <a:blip r:embed="rId22"/>
+                          <a:stretch>
+                            <a:fillRect/>
+                          </a:stretch>
+                        </pic:blipFill>
+                        <pic:spPr>
+                          <a:xfrm>
+                            <a:off x="0" y="0"/>
+                            <a:ext cx="1371600" cy="2967228"/>
+                          </a:xfrm>
+                          <a:prstGeom prst="rect"/>
+                        </pic:spPr>
+                      </pic:pic>
+                    </a:graphicData>
+                  </a:graphic>
+                </wp:inline>
+              </w:drawing>
+            </w:r>
+          </w:p>
+        </w:tc>
+        <w:tc>
+          <w:tcPr>
+            <w:tcW w:type="dxa" w:w="3216"/>
+          </w:tcPr>
+          <w:p>
+            <w:pPr>
+              <w:spacing w:after="40" w:before="40" w:line="240" w:lineRule="auto"/>
+            </w:pPr>
+            <w:r>
+              <w:rPr>
+                <w:rFonts w:ascii="Calibri" w:hAnsi="Calibri"/>
+                <w:sz w:val="19"/>
+              </w:rPr>
+              <w:drawing>
+                <wp:inline xmlns:a="http://schemas.openxmlformats.org/drawingml/2006/main" xmlns:pic="http://schemas.openxmlformats.org/drawingml/2006/picture">
+                  <wp:extent cx="3566160" cy="2394082"/>
+                  <wp:docPr id="13" name="Picture 13"/>
+                  <wp:cNvGraphicFramePr>
+                    <a:graphicFrameLocks noChangeAspect="1"/>
+                  </wp:cNvGraphicFramePr>
+                  <a:graphic>
+                    <a:graphicData uri="http://schemas.openxmlformats.org/drawingml/2006/picture">
+                      <pic:pic>
+                        <pic:nvPicPr>
+                          <pic:cNvPr id="0" name="products-desktop.png"/>
+                          <pic:cNvPicPr/>
+                        </pic:nvPicPr>
+                        <pic:blipFill>
+                          <a:blip r:embed="rId23"/>
+                          <a:stretch>
+                            <a:fillRect/>
+                          </a:stretch>
+                        </pic:blipFill>
+                        <pic:spPr>
+                          <a:xfrm>
+                            <a:off x="0" y="0"/>
+                            <a:ext cx="3566160" cy="2394082"/>
+                          </a:xfrm>
+                          <a:prstGeom prst="rect"/>
+                        </pic:spPr>
+                      </pic:pic>
+                    </a:graphicData>
+                  </a:graphic>
+                </wp:inline>
+              </w:drawing>
+            </w:r>
+          </w:p>
+        </w:tc>
+      </w:tr>
+      <w:tr>
+        <w:trPr>
+          <w:cantSplit/>
+        </w:trPr>
+        <w:tc>
+          <w:tcPr>
+            <w:tcW w:type="dxa" w:w="3216"/>
+          </w:tcPr>
+          <w:p>
+            <w:pPr>
+              <w:spacing w:after="40" w:before="40" w:line="240" w:lineRule="auto"/>
+            </w:pPr>
+            <w:r>
+              <w:rPr>
+                <w:rFonts w:ascii="Calibri" w:hAnsi="Calibri"/>
+                <w:b/>
+                <w:sz w:val="19"/>
+              </w:rPr>
+              <w:t>Basket</w:t>
+            </w:r>
+          </w:p>
+        </w:tc>
+        <w:tc>
+          <w:tcPr>
+            <w:tcW w:type="dxa" w:w="3216"/>
+          </w:tcPr>
+          <w:p>
+            <w:pPr>
+              <w:spacing w:after="40" w:before="40" w:line="240" w:lineRule="auto"/>
+            </w:pPr>
+            <w:r>
+              <w:rPr>
+                <w:rFonts w:ascii="Calibri" w:hAnsi="Calibri"/>
+                <w:sz w:val="19"/>
+              </w:rPr>
+              <w:drawing>
+                <wp:inline xmlns:a="http://schemas.openxmlformats.org/drawingml/2006/main" xmlns:pic="http://schemas.openxmlformats.org/drawingml/2006/picture">
+                  <wp:extent cx="1371600" cy="2967228"/>
+                  <wp:docPr id="14" name="Picture 14"/>
+                  <wp:cNvGraphicFramePr>
+                    <a:graphicFrameLocks noChangeAspect="1"/>
+                  </wp:cNvGraphicFramePr>
+                  <a:graphic>
+                    <a:graphicData uri="http://schemas.openxmlformats.org/drawingml/2006/picture">
+                      <pic:pic>
+                        <pic:nvPicPr>
+                          <pic:cNvPr id="0" name="cart-mobile.png"/>
+                          <pic:cNvPicPr/>
+                        </pic:nvPicPr>
+                        <pic:blipFill>
+                          <a:blip r:embed="rId24"/>
+                          <a:stretch>
+                            <a:fillRect/>
+                          </a:stretch>
+                        </pic:blipFill>
+                        <pic:spPr>
+                          <a:xfrm>
+                            <a:off x="0" y="0"/>
+                            <a:ext cx="1371600" cy="2967228"/>
+                          </a:xfrm>
+                          <a:prstGeom prst="rect"/>
+                        </pic:spPr>
+                      </pic:pic>
+                    </a:graphicData>
+                  </a:graphic>
+                </wp:inline>
+              </w:drawing>
+            </w:r>
+          </w:p>
+        </w:tc>
+        <w:tc>
+          <w:tcPr>
+            <w:tcW w:type="dxa" w:w="3216"/>
+          </w:tcPr>
+          <w:p>
+            <w:pPr>
+              <w:spacing w:after="40" w:before="40" w:line="240" w:lineRule="auto"/>
+            </w:pPr>
+            <w:r>
+              <w:rPr>
+                <w:rFonts w:ascii="Calibri" w:hAnsi="Calibri"/>
+                <w:sz w:val="19"/>
+              </w:rPr>
+              <w:drawing>
+                <wp:inline xmlns:a="http://schemas.openxmlformats.org/drawingml/2006/main" xmlns:pic="http://schemas.openxmlformats.org/drawingml/2006/picture">
+                  <wp:extent cx="3566160" cy="2394082"/>
+                  <wp:docPr id="15" name="Picture 15"/>
+                  <wp:cNvGraphicFramePr>
+                    <a:graphicFrameLocks noChangeAspect="1"/>
+                  </wp:cNvGraphicFramePr>
+                  <a:graphic>
+                    <a:graphicData uri="http://schemas.openxmlformats.org/drawingml/2006/picture">
+                      <pic:pic>
+                        <pic:nvPicPr>
+                          <pic:cNvPr id="0" name="cart-desktop.png"/>
+                          <pic:cNvPicPr/>
+                        </pic:nvPicPr>
+                        <pic:blipFill>
+                          <a:blip r:embed="rId25"/>
+                          <a:stretch>
+                            <a:fillRect/>
+                          </a:stretch>
+                        </pic:blipFill>
+                        <pic:spPr>
+                          <a:xfrm>
+                            <a:off x="0" y="0"/>
+                            <a:ext cx="3566160" cy="2394082"/>
+                          </a:xfrm>
+                          <a:prstGeom prst="rect"/>
+                        </pic:spPr>
+                      </pic:pic>
+                    </a:graphicData>
+                  </a:graphic>
+                </wp:inline>
+              </w:drawing>
+            </w:r>
+          </w:p>
+        </w:tc>
+      </w:tr>
+      <w:tr>
+        <w:trPr>
+          <w:cantSplit/>
+        </w:trPr>
+        <w:tc>
+          <w:tcPr>
+            <w:tcW w:type="dxa" w:w="3216"/>
+          </w:tcPr>
+          <w:p>
+            <w:pPr>
+              <w:spacing w:after="40" w:before="40" w:line="240" w:lineRule="auto"/>
+            </w:pPr>
+            <w:r>
+              <w:rPr>
+                <w:rFonts w:ascii="Calibri" w:hAnsi="Calibri"/>
+                <w:b/>
+                <w:sz w:val="19"/>
+              </w:rPr>
+              <w:t>Checkout</w:t>
+            </w:r>
+          </w:p>
+        </w:tc>
+        <w:tc>
+          <w:tcPr>
+            <w:tcW w:type="dxa" w:w="3216"/>
+          </w:tcPr>
+          <w:p>
+            <w:pPr>
+              <w:spacing w:after="40" w:before="40" w:line="240" w:lineRule="auto"/>
+            </w:pPr>
+            <w:r>
+              <w:rPr>
+                <w:rFonts w:ascii="Calibri" w:hAnsi="Calibri"/>
+                <w:sz w:val="19"/>
+              </w:rPr>
+              <w:drawing>
+                <wp:inline xmlns:a="http://schemas.openxmlformats.org/drawingml/2006/main" xmlns:pic="http://schemas.openxmlformats.org/drawingml/2006/picture">
+                  <wp:extent cx="1371600" cy="2967228"/>
+                  <wp:docPr id="16" name="Picture 16"/>
+                  <wp:cNvGraphicFramePr>
+                    <a:graphicFrameLocks noChangeAspect="1"/>
+                  </wp:cNvGraphicFramePr>
+                  <a:graphic>
+                    <a:graphicData uri="http://schemas.openxmlformats.org/drawingml/2006/picture">
+                      <pic:pic>
+                        <pic:nvPicPr>
+                          <pic:cNvPr id="0" name="checkout-mobile.png"/>
+                          <pic:cNvPicPr/>
+                        </pic:nvPicPr>
+                        <pic:blipFill>
+                          <a:blip r:embed="rId26"/>
+                          <a:stretch>
+                            <a:fillRect/>
+                          </a:stretch>
+                        </pic:blipFill>
+                        <pic:spPr>
+                          <a:xfrm>
+                            <a:off x="0" y="0"/>
+                            <a:ext cx="1371600" cy="2967228"/>
+                          </a:xfrm>
+                          <a:prstGeom prst="rect"/>
+                        </pic:spPr>
+                      </pic:pic>
+                    </a:graphicData>
+                  </a:graphic>
+                </wp:inline>
+              </w:drawing>
+            </w:r>
+          </w:p>
+        </w:tc>
+        <w:tc>
+          <w:tcPr>
+            <w:tcW w:type="dxa" w:w="3216"/>
+          </w:tcPr>
+          <w:p>
+            <w:pPr>
+              <w:spacing w:after="40" w:before="40" w:line="240" w:lineRule="auto"/>
+            </w:pPr>
+            <w:r>
+              <w:rPr>
+                <w:rFonts w:ascii="Calibri" w:hAnsi="Calibri"/>
+                <w:sz w:val="19"/>
+              </w:rPr>
+              <w:drawing>
+                <wp:inline xmlns:a="http://schemas.openxmlformats.org/drawingml/2006/main" xmlns:pic="http://schemas.openxmlformats.org/drawingml/2006/picture">
+                  <wp:extent cx="3566160" cy="2394082"/>
+                  <wp:docPr id="17" name="Picture 17"/>
+                  <wp:cNvGraphicFramePr>
+                    <a:graphicFrameLocks noChangeAspect="1"/>
+                  </wp:cNvGraphicFramePr>
+                  <a:graphic>
+                    <a:graphicData uri="http://schemas.openxmlformats.org/drawingml/2006/picture">
+                      <pic:pic>
+                        <pic:nvPicPr>
+                          <pic:cNvPr id="0" name="checkout-desktop.png"/>
+                          <pic:cNvPicPr/>
+                        </pic:nvPicPr>
+                        <pic:blipFill>
+                          <a:blip r:embed="rId27"/>
+                          <a:stretch>
+                            <a:fillRect/>
+                          </a:stretch>
+                        </pic:blipFill>
+                        <pic:spPr>
+                          <a:xfrm>
+                            <a:off x="0" y="0"/>
+                            <a:ext cx="3566160" cy="2394082"/>
+                          </a:xfrm>
+                          <a:prstGeom prst="rect"/>
+                        </pic:spPr>
+                      </pic:pic>
+                    </a:graphicData>
+                  </a:graphic>
+                </wp:inline>
+              </w:drawing>
+            </w:r>
+          </w:p>
+        </w:tc>
+      </w:tr>
+      <w:tr>
+        <w:trPr>
+          <w:cantSplit/>
+        </w:trPr>
+        <w:tc>
+          <w:tcPr>
+            <w:tcW w:type="dxa" w:w="3216"/>
+          </w:tcPr>
+          <w:p>
+            <w:pPr>
+              <w:spacing w:after="40" w:before="40" w:line="240" w:lineRule="auto"/>
+            </w:pPr>
+            <w:r>
+              <w:rPr>
+                <w:rFonts w:ascii="Calibri" w:hAnsi="Calibri"/>
+                <w:b/>
+                <w:sz w:val="19"/>
+              </w:rPr>
+              <w:t>Wishlist</w:t>
+            </w:r>
+          </w:p>
+        </w:tc>
+        <w:tc>
+          <w:tcPr>
+            <w:tcW w:type="dxa" w:w="3216"/>
+          </w:tcPr>
+          <w:p>
+            <w:pPr>
+              <w:spacing w:after="40" w:before="40" w:line="240" w:lineRule="auto"/>
+            </w:pPr>
+            <w:r>
+              <w:rPr>
+                <w:rFonts w:ascii="Calibri" w:hAnsi="Calibri"/>
+                <w:sz w:val="19"/>
+              </w:rPr>
+              <w:drawing>
+                <wp:inline xmlns:a="http://schemas.openxmlformats.org/drawingml/2006/main" xmlns:pic="http://schemas.openxmlformats.org/drawingml/2006/picture">
+                  <wp:extent cx="1371600" cy="2967228"/>
+                  <wp:docPr id="18" name="Picture 18"/>
+                  <wp:cNvGraphicFramePr>
+                    <a:graphicFrameLocks noChangeAspect="1"/>
+                  </wp:cNvGraphicFramePr>
+                  <a:graphic>
+                    <a:graphicData uri="http://schemas.openxmlformats.org/drawingml/2006/picture">
+                      <pic:pic>
+                        <pic:nvPicPr>
+                          <pic:cNvPr id="0" name="wishlist-mobile.png"/>
+                          <pic:cNvPicPr/>
+                        </pic:nvPicPr>
+                        <pic:blipFill>
+                          <a:blip r:embed="rId28"/>
+                          <a:stretch>
+                            <a:fillRect/>
+                          </a:stretch>
+                        </pic:blipFill>
+                        <pic:spPr>
+                          <a:xfrm>
+                            <a:off x="0" y="0"/>
+                            <a:ext cx="1371600" cy="2967228"/>
+                          </a:xfrm>
+                          <a:prstGeom prst="rect"/>
+                        </pic:spPr>
+                      </pic:pic>
+                    </a:graphicData>
+                  </a:graphic>
+                </wp:inline>
+              </w:drawing>
+            </w:r>
+          </w:p>
+        </w:tc>
+        <w:tc>
+          <w:tcPr>
+            <w:tcW w:type="dxa" w:w="3216"/>
+          </w:tcPr>
+          <w:p>
+            <w:pPr>
+              <w:spacing w:after="40" w:before="40" w:line="240" w:lineRule="auto"/>
+            </w:pPr>
+            <w:r>
+              <w:rPr>
+                <w:rFonts w:ascii="Calibri" w:hAnsi="Calibri"/>
+                <w:sz w:val="19"/>
+              </w:rPr>
+              <w:drawing>
+                <wp:inline xmlns:a="http://schemas.openxmlformats.org/drawingml/2006/main" xmlns:pic="http://schemas.openxmlformats.org/drawingml/2006/picture">
+                  <wp:extent cx="3566160" cy="2394082"/>
+                  <wp:docPr id="19" name="Picture 19"/>
+                  <wp:cNvGraphicFramePr>
+                    <a:graphicFrameLocks noChangeAspect="1"/>
+                  </wp:cNvGraphicFramePr>
+                  <a:graphic>
+                    <a:graphicData uri="http://schemas.openxmlformats.org/drawingml/2006/picture">
+                      <pic:pic>
+                        <pic:nvPicPr>
+                          <pic:cNvPr id="0" name="wishlist-desktop.png"/>
+                          <pic:cNvPicPr/>
+                        </pic:nvPicPr>
+                        <pic:blipFill>
+                          <a:blip r:embed="rId29"/>
+                          <a:stretch>
+                            <a:fillRect/>
+                          </a:stretch>
+                        </pic:blipFill>
+                        <pic:spPr>
+                          <a:xfrm>
+                            <a:off x="0" y="0"/>
+                            <a:ext cx="3566160" cy="2394082"/>
+                          </a:xfrm>
+                          <a:prstGeom prst="rect"/>
+                        </pic:spPr>
+                      </pic:pic>
+                    </a:graphicData>
+                  </a:graphic>
+                </wp:inline>
+              </w:drawing>
+            </w:r>
+          </w:p>
+        </w:tc>
+      </w:tr>
+      <w:tr>
+        <w:trPr>
+          <w:cantSplit/>
+        </w:trPr>
+        <w:tc>
+          <w:tcPr>
+            <w:tcW w:type="dxa" w:w="3216"/>
+          </w:tcPr>
+          <w:p>
+            <w:pPr>
+              <w:spacing w:after="40" w:before="40" w:line="240" w:lineRule="auto"/>
+            </w:pPr>
+            <w:r>
+              <w:rPr>
+                <w:rFonts w:ascii="Calibri" w:hAnsi="Calibri"/>
+                <w:b/>
+                <w:sz w:val="19"/>
+              </w:rPr>
+              <w:t>Support</w:t>
+            </w:r>
+          </w:p>
+        </w:tc>
+        <w:tc>
+          <w:tcPr>
+            <w:tcW w:type="dxa" w:w="3216"/>
+          </w:tcPr>
+          <w:p>
+            <w:pPr>
+              <w:spacing w:after="40" w:before="40" w:line="240" w:lineRule="auto"/>
+            </w:pPr>
+            <w:r>
+              <w:rPr>
+                <w:rFonts w:ascii="Calibri" w:hAnsi="Calibri"/>
+                <w:sz w:val="19"/>
+              </w:rPr>
+              <w:drawing>
+                <wp:inline xmlns:a="http://schemas.openxmlformats.org/drawingml/2006/main" xmlns:pic="http://schemas.openxmlformats.org/drawingml/2006/picture">
+                  <wp:extent cx="1371600" cy="2967228"/>
+                  <wp:docPr id="20" name="Picture 20"/>
+                  <wp:cNvGraphicFramePr>
+                    <a:graphicFrameLocks noChangeAspect="1"/>
+                  </wp:cNvGraphicFramePr>
+                  <a:graphic>
+                    <a:graphicData uri="http://schemas.openxmlformats.org/drawingml/2006/picture">
+                      <pic:pic>
+                        <pic:nvPicPr>
+                          <pic:cNvPr id="0" name="support-mobile.png"/>
+                          <pic:cNvPicPr/>
+                        </pic:nvPicPr>
+                        <pic:blipFill>
+                          <a:blip r:embed="rId30"/>
+                          <a:stretch>
+                            <a:fillRect/>
+                          </a:stretch>
+                        </pic:blipFill>
+                        <pic:spPr>
+                          <a:xfrm>
+                            <a:off x="0" y="0"/>
+                            <a:ext cx="1371600" cy="2967228"/>
+                          </a:xfrm>
+                          <a:prstGeom prst="rect"/>
+                        </pic:spPr>
+                      </pic:pic>
+                    </a:graphicData>
+                  </a:graphic>
+                </wp:inline>
+              </w:drawing>
+            </w:r>
+          </w:p>
+        </w:tc>
+        <w:tc>
+          <w:tcPr>
+            <w:tcW w:type="dxa" w:w="3216"/>
+          </w:tcPr>
+          <w:p>
+            <w:pPr>
+              <w:spacing w:after="40" w:before="40" w:line="240" w:lineRule="auto"/>
+            </w:pPr>
+            <w:r>
+              <w:rPr>
+                <w:rFonts w:ascii="Calibri" w:hAnsi="Calibri"/>
+                <w:sz w:val="19"/>
+              </w:rPr>
+              <w:drawing>
+                <wp:inline xmlns:a="http://schemas.openxmlformats.org/drawingml/2006/main" xmlns:pic="http://schemas.openxmlformats.org/drawingml/2006/picture">
+                  <wp:extent cx="3566160" cy="2394082"/>
+                  <wp:docPr id="21" name="Picture 21"/>
+                  <wp:cNvGraphicFramePr>
+                    <a:graphicFrameLocks noChangeAspect="1"/>
+                  </wp:cNvGraphicFramePr>
+                  <a:graphic>
+                    <a:graphicData uri="http://schemas.openxmlformats.org/drawingml/2006/picture">
+                      <pic:pic>
+                        <pic:nvPicPr>
+                          <pic:cNvPr id="0" name="support-desktop.png"/>
+                          <pic:cNvPicPr/>
+                        </pic:nvPicPr>
+                        <pic:blipFill>
+                          <a:blip r:embed="rId31"/>
+                          <a:stretch>
+                            <a:fillRect/>
+                          </a:stretch>
+                        </pic:blipFill>
+                        <pic:spPr>
+                          <a:xfrm>
+                            <a:off x="0" y="0"/>
+                            <a:ext cx="3566160" cy="2394082"/>
+                          </a:xfrm>
+                          <a:prstGeom prst="rect"/>
+                        </pic:spPr>
+                      </pic:pic>
+                    </a:graphicData>
+                  </a:graphic>
+                </wp:inline>
+              </w:drawing>
             </w:r>
           </w:p>
         </w:tc>
@@ -12682,7 +13599,7 @@
       <w:pPr>
         <w:pStyle w:val="Heading2"/>
         <w:pBdr>
-          <w:bottom w:val="single" w:sz="12" w:space="2" w:color="5B2BD9"/>
+          <w:bottom w:val="single" w:sz="12" w:space="2" w:color="000000"/>
         </w:pBdr>
       </w:pPr>
       <w:r>
@@ -12754,7 +13671,7 @@
       <w:hyperlink r:id="rId9">
         <w:r>
           <w:rPr>
-            <w:color w:val="5B2BD9"/>
+            <w:color w:val="000000"/>
             <w:u w:val="single"/>
           </w:rPr>
           <w:t xml:space="preserve">https://nihmathullahmazhar.github.io/toy-haven/</w:t>
@@ -12766,14 +13683,14 @@
     </w:p>
     <w:p>
       <w:r>
-        <w:t xml:space="preserve">All paths are relative, so the site works both at the repository sub-path on GitHub Pages and when served from the root of any other server. </w:t>
+        <w:t xml:space="preserve">Every path in the site is relative, so it works at the repository sub-path on GitHub Pages and equally from the root of any other server. </w:t>
       </w:r>
     </w:p>
     <w:p>
       <w:pPr>
         <w:pStyle w:val="Heading2"/>
         <w:pBdr>
-          <w:bottom w:val="single" w:sz="12" w:space="2" w:color="5B2BD9"/>
+          <w:bottom w:val="single" w:sz="12" w:space="2" w:color="000000"/>
         </w:pBdr>
       </w:pPr>
       <w:r>
@@ -13283,7 +14200,7 @@
       <w:rFonts w:asciiTheme="majorHAnsi" w:eastAsiaTheme="majorEastAsia" w:hAnsiTheme="majorHAnsi" w:cstheme="majorBidi" w:ascii="Calibri" w:hAnsi="Calibri"/>
       <w:b/>
       <w:bCs/>
-      <w:color w:val="5B2BD9"/>
+      <w:color w:val="000000"/>
       <w:sz w:val="52"/>
       <w:szCs w:val="28"/>
     </w:rPr>
@@ -13307,7 +14224,7 @@
       <w:rFonts w:asciiTheme="majorHAnsi" w:eastAsiaTheme="majorEastAsia" w:hAnsiTheme="majorHAnsi" w:cstheme="majorBidi" w:ascii="Calibri" w:hAnsi="Calibri"/>
       <w:b/>
       <w:bCs/>
-      <w:color w:val="5B2BD9"/>
+      <w:color w:val="000000"/>
       <w:sz w:val="34"/>
       <w:szCs w:val="26"/>
     </w:rPr>

</xml_diff>